<commit_message>
Add CV tips and strategies for tech freelancers and contractors
</commit_message>
<xml_diff>
--- a/Andrei_Stoian_CV_2026.docx
+++ b/Andrei_Stoian_CV_2026.docx
@@ -98,27 +98,7 @@
           <w:szCs w:val="22"/>
           <w:lang w:val="en-NZ"/>
         </w:rPr>
-        <w:t xml:space="preserve">25 </w:t>
-      </w:r>
-      <w:proofErr w:type="spellStart"/>
-      <w:r>
-        <w:rPr>
-          <w:rFonts w:ascii="Verdana" w:hAnsi="Verdana" w:cs="Arial"/>
-          <w:sz w:val="22"/>
-          <w:szCs w:val="22"/>
-          <w:lang w:val="en-NZ"/>
-        </w:rPr>
-        <w:t>Condomine</w:t>
-      </w:r>
-      <w:proofErr w:type="spellEnd"/>
-      <w:r>
-        <w:rPr>
-          <w:rFonts w:ascii="Verdana" w:hAnsi="Verdana" w:cs="Arial"/>
-          <w:sz w:val="22"/>
-          <w:szCs w:val="22"/>
-          <w:lang w:val="en-NZ"/>
-        </w:rPr>
-        <w:t xml:space="preserve"> St, Sippy Downs</w:t>
+        <w:t>25 Condomine St, Sippy Downs</w:t>
       </w:r>
     </w:p>
     <w:p>
@@ -230,7 +210,7 @@
                 <w:lang w:val="en-NZ" w:eastAsia="en-NZ"/>
               </w:rPr>
               <w:drawing>
-                <wp:anchor distT="0" distB="0" distL="114300" distR="114300" simplePos="0" relativeHeight="251653120" behindDoc="1" locked="0" layoutInCell="1" allowOverlap="1" wp14:anchorId="54802C68" wp14:editId="557A35E9">
+                <wp:anchor distT="0" distB="0" distL="114300" distR="114300" simplePos="0" relativeHeight="251653120" behindDoc="1" locked="0" layoutInCell="1" allowOverlap="1" wp14:anchorId="54802C68" wp14:editId="3208EAA4">
                   <wp:simplePos x="0" y="0"/>
                   <wp:positionH relativeFrom="column">
                     <wp:posOffset>3810</wp:posOffset>
@@ -597,29 +577,7 @@
             <w:szCs w:val="22"/>
             <w:lang w:val="en-NZ"/>
           </w:rPr>
-          <w:t xml:space="preserve"> / H2O </w:t>
-        </w:r>
-        <w:proofErr w:type="spellStart"/>
-        <w:r>
-          <w:rPr>
-            <w:rStyle w:val="Hyperlink"/>
-            <w:rFonts w:ascii="Verdana" w:hAnsi="Verdana" w:cs="Arial"/>
-            <w:sz w:val="22"/>
-            <w:szCs w:val="22"/>
-            <w:lang w:val="en-NZ"/>
-          </w:rPr>
-          <w:t>AutoML</w:t>
-        </w:r>
-        <w:proofErr w:type="spellEnd"/>
-        <w:r>
-          <w:rPr>
-            <w:rStyle w:val="Hyperlink"/>
-            <w:rFonts w:ascii="Verdana" w:hAnsi="Verdana" w:cs="Arial"/>
-            <w:sz w:val="22"/>
-            <w:szCs w:val="22"/>
-            <w:lang w:val="en-NZ"/>
-          </w:rPr>
-          <w:t xml:space="preserve"> (automated machine learning) &amp; LIME</w:t>
+          <w:t xml:space="preserve"> / H2O AutoML (automated machine learning) &amp; LIME</w:t>
         </w:r>
       </w:hyperlink>
     </w:p>
@@ -889,81 +847,126 @@
     </w:p>
     <w:p>
       <w:pPr>
+        <w:spacing w:after="120"/>
         <w:rPr>
           <w:rFonts w:ascii="Verdana" w:hAnsi="Verdana" w:cs="Arial"/>
           <w:sz w:val="22"/>
           <w:szCs w:val="22"/>
-        </w:rPr>
-      </w:pPr>
-      <w:r>
+          <w:lang w:val="en-NZ"/>
+        </w:rPr>
+      </w:pPr>
+    </w:p>
+    <w:p>
+      <w:pPr>
+        <w:spacing w:after="120"/>
         <w:rPr>
           <w:rFonts w:ascii="Verdana" w:hAnsi="Verdana" w:cs="Arial"/>
           <w:sz w:val="22"/>
           <w:szCs w:val="22"/>
-        </w:rPr>
-        <w:t xml:space="preserve">Senior data and analytics leader with 10+ years’ experience delivering institution-level insights, forecasting, performance reporting and evidence-based decision support across higher education and government. Proven ability to translate strategy into operational insight, lead multi-disciplinary analytics teams, and partner with executives to drive planning, performance and policy outcomes. </w:t>
+          <w:lang w:val="en-NZ"/>
+        </w:rPr>
+      </w:pPr>
+      <w:r>
+        <w:rPr>
+          <w:rFonts w:ascii="Verdana" w:hAnsi="Verdana" w:cs="Arial"/>
+          <w:sz w:val="22"/>
+          <w:szCs w:val="22"/>
+          <w:lang w:val="en-NZ"/>
+        </w:rPr>
+        <w:t>Senior data transformation and governance leader with over 1</w:t>
+      </w:r>
+      <w:r>
+        <w:rPr>
+          <w:rFonts w:ascii="Verdana" w:hAnsi="Verdana" w:cs="Arial"/>
+          <w:sz w:val="22"/>
+          <w:szCs w:val="22"/>
+          <w:lang w:val="en-NZ"/>
+        </w:rPr>
+        <w:t>5+</w:t>
+      </w:r>
+      <w:r>
+        <w:rPr>
+          <w:rFonts w:ascii="Verdana" w:hAnsi="Verdana" w:cs="Arial"/>
+          <w:sz w:val="22"/>
+          <w:szCs w:val="22"/>
+          <w:lang w:val="en-NZ"/>
+        </w:rPr>
+        <w:t xml:space="preserve"> years of experience spanning telecommunications, health, government, and higher education — with direct industry experience inside a major Australian telco. I bring a rare combination: deep domain knowledge of how telecommunications data is generated, managed, and regulated, combined with proven executive leadership in data governance, risk reduction, data quality, and enterprise transformation.</w:t>
       </w:r>
     </w:p>
     <w:p>
       <w:pPr>
+        <w:spacing w:after="120"/>
         <w:rPr>
           <w:rFonts w:ascii="Verdana" w:hAnsi="Verdana" w:cs="Arial"/>
           <w:sz w:val="22"/>
           <w:szCs w:val="22"/>
-        </w:rPr>
-      </w:pPr>
-    </w:p>
-    <w:p>
-      <w:pPr>
+          <w:lang w:val="en-NZ"/>
+        </w:rPr>
+      </w:pPr>
+      <w:r>
         <w:rPr>
           <w:rFonts w:ascii="Verdana" w:hAnsi="Verdana" w:cs="Arial"/>
           <w:sz w:val="22"/>
           <w:szCs w:val="22"/>
-        </w:rPr>
-      </w:pPr>
-      <w:r>
+          <w:lang w:val="en-NZ"/>
+        </w:rPr>
+        <w:t>At UniSC, I established the enterprise data governance foundations, led data lifecycle compliance, embedded risk-aware data practices, and built the platforms and operating models that senior leaders trust for planning, accountability, and decision-making. Earlier, at Spark New Zealand, I led capacity planning and network analytics for 3G/4G infrastructure — working directly with spectrum, subscriber behaviour, licensing compliance, and the data systems that underpin network operations.</w:t>
+      </w:r>
+    </w:p>
+    <w:p>
+      <w:pPr>
+        <w:spacing w:after="120"/>
         <w:rPr>
           <w:rFonts w:ascii="Verdana" w:hAnsi="Verdana" w:cs="Arial"/>
           <w:sz w:val="22"/>
           <w:szCs w:val="22"/>
-        </w:rPr>
-        <w:t>Deep expertise in student journey analytics, load planning, governance-enabled analytics, and enterprise data platforms, with a strong track record of building insight-driven culture in complex organisations.</w:t>
+          <w:lang w:val="en-NZ"/>
+        </w:rPr>
+      </w:pPr>
+      <w:r>
+        <w:rPr>
+          <w:rFonts w:ascii="Verdana" w:hAnsi="Verdana" w:cs="Arial"/>
+          <w:sz w:val="22"/>
+          <w:szCs w:val="22"/>
+          <w:lang w:val="en-NZ"/>
+        </w:rPr>
+        <w:t>I understand what it means to govern data at scale in a regulated, customer-facing telecommunications environment — and I know how to build the culture, frameworks, and infrastructure to get it right.</w:t>
       </w:r>
     </w:p>
     <w:p>
       <w:pPr>
-        <w:pStyle w:val="Heading4"/>
-        <w:rPr>
-          <w:lang w:val="en-AU" w:eastAsia="en-AU"/>
-        </w:rPr>
-      </w:pPr>
-      <w:r>
-        <w:rPr>
-          <w:rFonts w:ascii="Verdana" w:eastAsia="Times New Roman" w:hAnsi="Verdana" w:cs="Arial"/>
-          <w:b/>
-          <w:bCs/>
-          <w:i w:val="0"/>
-          <w:iCs w:val="0"/>
-          <w:color w:val="auto"/>
+        <w:spacing w:after="120"/>
+        <w:rPr>
+          <w:rFonts w:ascii="Verdana" w:hAnsi="Verdana" w:cs="Arial"/>
           <w:sz w:val="22"/>
           <w:szCs w:val="22"/>
-          <w:lang w:val="en-AU" w:eastAsia="en-US"/>
-        </w:rPr>
-        <w:t>Institutional Insights &amp; Planning Impact</w:t>
+          <w:lang w:val="en-NZ"/>
+        </w:rPr>
+      </w:pPr>
+      <w:r>
+        <w:rPr>
+          <w:rFonts w:ascii="Verdana" w:hAnsi="Verdana" w:cs="Arial"/>
+          <w:sz w:val="22"/>
+          <w:szCs w:val="22"/>
+          <w:lang w:val="en-NZ"/>
+        </w:rPr>
+        <w:t>CORE CAPABILITIES</w:t>
       </w:r>
     </w:p>
     <w:p>
       <w:pPr>
-        <w:pStyle w:val="NormalWeb"/>
+        <w:pStyle w:val="ListParagraph"/>
         <w:numPr>
           <w:ilvl w:val="0"/>
-          <w:numId w:val="47"/>
+          <w:numId w:val="59"/>
         </w:numPr>
+        <w:spacing w:after="80"/>
         <w:rPr>
           <w:rFonts w:ascii="Verdana" w:hAnsi="Verdana" w:cs="Arial"/>
           <w:sz w:val="22"/>
           <w:szCs w:val="22"/>
-          <w:lang w:val="en-GB" w:eastAsia="en-GB"/>
+          <w:lang w:val="en-NZ"/>
         </w:rPr>
       </w:pPr>
       <w:r>
@@ -971,43 +974,49 @@
           <w:rFonts w:ascii="Verdana" w:hAnsi="Verdana" w:cs="Arial"/>
           <w:sz w:val="22"/>
           <w:szCs w:val="22"/>
-          <w:lang w:val="en-GB" w:eastAsia="en-GB"/>
-        </w:rPr>
-        <w:t xml:space="preserve">Partner with executive leaders to deliver </w:t>
+          <w:lang w:val="en-NZ"/>
+        </w:rPr>
+        <w:t>Data transformation strategy and execution</w:t>
       </w:r>
-      <w:r>
-        <w:rPr>
-          <w:rFonts w:ascii="Verdana" w:hAnsi="Verdana" w:cs="Arial"/>
-          <w:b/>
-          <w:bCs/>
-          <w:sz w:val="22"/>
-          <w:szCs w:val="22"/>
-          <w:lang w:val="en-GB" w:eastAsia="en-GB"/>
-        </w:rPr>
-        <w:t>institution-level insights</w:t>
-      </w:r>
-      <w:r>
+    </w:p>
+    <w:p>
+      <w:pPr>
+        <w:pStyle w:val="ListParagraph"/>
+        <w:numPr>
+          <w:ilvl w:val="0"/>
+          <w:numId w:val="59"/>
+        </w:numPr>
+        <w:spacing w:after="80"/>
         <w:rPr>
           <w:rFonts w:ascii="Verdana" w:hAnsi="Verdana" w:cs="Arial"/>
           <w:sz w:val="22"/>
           <w:szCs w:val="22"/>
-          <w:lang w:val="en-GB" w:eastAsia="en-GB"/>
-        </w:rPr>
-        <w:t xml:space="preserve"> supporting strategic planning, performance monitoring and investment decisions.</w:t>
+          <w:lang w:val="en-NZ"/>
+        </w:rPr>
+      </w:pPr>
+      <w:r>
+        <w:rPr>
+          <w:rFonts w:ascii="Verdana" w:hAnsi="Verdana" w:cs="Arial"/>
+          <w:sz w:val="22"/>
+          <w:szCs w:val="22"/>
+          <w:lang w:val="en-NZ"/>
+        </w:rPr>
+        <w:t>Data lifecycle management — from acquisition to disposal</w:t>
       </w:r>
     </w:p>
     <w:p>
       <w:pPr>
-        <w:pStyle w:val="NormalWeb"/>
+        <w:pStyle w:val="ListParagraph"/>
         <w:numPr>
           <w:ilvl w:val="0"/>
-          <w:numId w:val="47"/>
+          <w:numId w:val="59"/>
         </w:numPr>
+        <w:spacing w:after="80"/>
         <w:rPr>
           <w:rFonts w:ascii="Verdana" w:hAnsi="Verdana" w:cs="Arial"/>
           <w:sz w:val="22"/>
           <w:szCs w:val="22"/>
-          <w:lang w:val="en-GB" w:eastAsia="en-GB"/>
+          <w:lang w:val="en-NZ"/>
         </w:rPr>
       </w:pPr>
       <w:r>
@@ -1015,43 +1024,50 @@
           <w:rFonts w:ascii="Verdana" w:hAnsi="Verdana" w:cs="Arial"/>
           <w:sz w:val="22"/>
           <w:szCs w:val="22"/>
-          <w:lang w:val="en-GB" w:eastAsia="en-GB"/>
-        </w:rPr>
-        <w:t xml:space="preserve">Established foundations for </w:t>
+          <w:lang w:val="en-NZ"/>
+        </w:rPr>
+        <w:t>Data quality frameworks, metrics, and continuous improvement</w:t>
       </w:r>
-      <w:r>
-        <w:rPr>
-          <w:rFonts w:ascii="Verdana" w:hAnsi="Verdana" w:cs="Arial"/>
-          <w:b/>
-          <w:bCs/>
-          <w:sz w:val="22"/>
-          <w:szCs w:val="22"/>
-          <w:lang w:val="en-GB" w:eastAsia="en-GB"/>
-        </w:rPr>
-        <w:t>student journey reporting</w:t>
-      </w:r>
-      <w:r>
+    </w:p>
+    <w:p>
+      <w:pPr>
+        <w:pStyle w:val="ListParagraph"/>
+        <w:numPr>
+          <w:ilvl w:val="0"/>
+          <w:numId w:val="59"/>
+        </w:numPr>
+        <w:spacing w:after="80"/>
         <w:rPr>
           <w:rFonts w:ascii="Verdana" w:hAnsi="Verdana" w:cs="Arial"/>
           <w:sz w:val="22"/>
           <w:szCs w:val="22"/>
-          <w:lang w:val="en-GB" w:eastAsia="en-GB"/>
-        </w:rPr>
-        <w:t>, integrating lifecycle views across enrolment, progression, load and outcomes.</w:t>
+          <w:lang w:val="en-NZ"/>
+        </w:rPr>
+      </w:pPr>
+      <w:r>
+        <w:rPr>
+          <w:rFonts w:ascii="Verdana" w:hAnsi="Verdana" w:cs="Arial"/>
+          <w:sz w:val="22"/>
+          <w:szCs w:val="22"/>
+          <w:lang w:val="en-NZ"/>
+        </w:rPr>
+        <w:lastRenderedPageBreak/>
+        <w:t>Data risk reduction and risk-aware data practices</w:t>
       </w:r>
     </w:p>
     <w:p>
       <w:pPr>
-        <w:pStyle w:val="NormalWeb"/>
+        <w:pStyle w:val="ListParagraph"/>
         <w:numPr>
           <w:ilvl w:val="0"/>
-          <w:numId w:val="47"/>
+          <w:numId w:val="59"/>
         </w:numPr>
+        <w:spacing w:after="80"/>
         <w:rPr>
           <w:rFonts w:ascii="Verdana" w:hAnsi="Verdana" w:cs="Arial"/>
           <w:sz w:val="22"/>
           <w:szCs w:val="22"/>
-          <w:lang w:val="en-GB" w:eastAsia="en-GB"/>
+          <w:lang w:val="en-NZ"/>
         </w:rPr>
       </w:pPr>
       <w:r>
@@ -1059,52 +1075,49 @@
           <w:rFonts w:ascii="Verdana" w:hAnsi="Verdana" w:cs="Arial"/>
           <w:sz w:val="22"/>
           <w:szCs w:val="22"/>
-          <w:lang w:val="en-GB" w:eastAsia="en-GB"/>
-        </w:rPr>
-        <w:t xml:space="preserve">Enable </w:t>
+          <w:lang w:val="en-NZ"/>
+        </w:rPr>
+        <w:t>Data governance design and operating model development</w:t>
       </w:r>
-      <w:r>
+    </w:p>
+    <w:p>
+      <w:pPr>
+        <w:pStyle w:val="ListParagraph"/>
+        <w:numPr>
+          <w:ilvl w:val="0"/>
+          <w:numId w:val="59"/>
+        </w:numPr>
+        <w:spacing w:after="80"/>
         <w:rPr>
           <w:rFonts w:ascii="Verdana" w:hAnsi="Verdana" w:cs="Arial"/>
           <w:sz w:val="22"/>
           <w:szCs w:val="22"/>
-          <w:lang w:val="en-GB" w:eastAsia="en-GB"/>
-        </w:rPr>
-        <w:t xml:space="preserve">visualisation of </w:t>
-      </w:r>
-      <w:r>
-        <w:rPr>
-          <w:rFonts w:ascii="Verdana" w:hAnsi="Verdana" w:cs="Arial"/>
-          <w:b/>
-          <w:bCs/>
-          <w:sz w:val="22"/>
-          <w:szCs w:val="22"/>
-          <w:lang w:val="en-GB" w:eastAsia="en-GB"/>
-        </w:rPr>
-        <w:t>load planning and forecasting capability</w:t>
-      </w:r>
+          <w:lang w:val="en-NZ"/>
+        </w:rPr>
+      </w:pPr>
       <w:r>
         <w:rPr>
           <w:rFonts w:ascii="Verdana" w:hAnsi="Verdana" w:cs="Arial"/>
           <w:sz w:val="22"/>
           <w:szCs w:val="22"/>
-          <w:lang w:val="en-GB" w:eastAsia="en-GB"/>
-        </w:rPr>
-        <w:t xml:space="preserve"> through governed data models, trusted metrics and scalable analytics platforms.</w:t>
+          <w:lang w:val="en-NZ"/>
+        </w:rPr>
+        <w:t>Regulatory compliance: Privacy Law, licensing obligations, data classification</w:t>
       </w:r>
     </w:p>
     <w:p>
       <w:pPr>
-        <w:pStyle w:val="NormalWeb"/>
+        <w:pStyle w:val="ListParagraph"/>
         <w:numPr>
           <w:ilvl w:val="0"/>
-          <w:numId w:val="47"/>
+          <w:numId w:val="59"/>
         </w:numPr>
+        <w:spacing w:after="80"/>
         <w:rPr>
           <w:rFonts w:ascii="Verdana" w:hAnsi="Verdana" w:cs="Arial"/>
           <w:sz w:val="22"/>
           <w:szCs w:val="22"/>
-          <w:lang w:val="en-GB" w:eastAsia="en-GB"/>
+          <w:lang w:val="en-NZ"/>
         </w:rPr>
       </w:pPr>
       <w:r>
@@ -1112,50 +1125,114 @@
           <w:rFonts w:ascii="Verdana" w:hAnsi="Verdana" w:cs="Arial"/>
           <w:sz w:val="22"/>
           <w:szCs w:val="22"/>
-          <w:lang w:val="en-GB" w:eastAsia="en-GB"/>
-        </w:rPr>
-        <w:t>Provide expert advice to senior stakeholders on data interpretation, limitations, and strategic implications.</w:t>
+          <w:lang w:val="en-NZ"/>
+        </w:rPr>
+        <w:t>Executive stakeholder engagement and strategic advisory</w:t>
       </w:r>
     </w:p>
     <w:p>
       <w:pPr>
-        <w:pStyle w:val="Heading1"/>
-        <w:rPr>
-          <w:rFonts w:ascii="Verdana" w:hAnsi="Verdana"/>
-          <w:b w:val="0"/>
-          <w:bCs w:val="0"/>
+        <w:pStyle w:val="ListParagraph"/>
+        <w:numPr>
+          <w:ilvl w:val="0"/>
+          <w:numId w:val="59"/>
+        </w:numPr>
+        <w:spacing w:after="80"/>
+        <w:rPr>
+          <w:rFonts w:ascii="Verdana" w:hAnsi="Verdana" w:cs="Arial"/>
           <w:sz w:val="22"/>
           <w:szCs w:val="22"/>
-          <w:lang w:val="en-GB" w:eastAsia="en-GB"/>
-        </w:rPr>
-      </w:pPr>
-    </w:p>
-    <w:p>
-      <w:pPr>
-        <w:pStyle w:val="Heading1"/>
-        <w:rPr>
-          <w:rFonts w:ascii="Verdana" w:hAnsi="Verdana"/>
-          <w:b w:val="0"/>
-          <w:bCs w:val="0"/>
+          <w:lang w:val="en-NZ"/>
+        </w:rPr>
+      </w:pPr>
+      <w:r>
+        <w:rPr>
+          <w:rFonts w:ascii="Verdana" w:hAnsi="Verdana" w:cs="Arial"/>
           <w:sz w:val="22"/>
           <w:szCs w:val="22"/>
-          <w:lang w:val="en-GB" w:eastAsia="en-GB"/>
-        </w:rPr>
-      </w:pPr>
-      <w:r>
-        <w:rPr>
-          <w:rFonts w:ascii="Verdana" w:hAnsi="Verdana"/>
-          <w:b w:val="0"/>
-          <w:bCs w:val="0"/>
-          <w:sz w:val="22"/>
-          <w:szCs w:val="22"/>
-          <w:lang w:val="en-GB" w:eastAsia="en-GB"/>
-        </w:rPr>
-        <w:t>Throughout my career, whether leading the development of the Shared Data Platform (SDP) or managing data models for educational infrastructure, I have consistently demonstrated skills in trend analysis, reporting, and data process governance. This experience equips me to drive innovation and deliver impactful solutions in my current role.</w:t>
+          <w:lang w:val="en-NZ"/>
+        </w:rPr>
+        <w:t>Building and mentoring high-performing data teams</w:t>
       </w:r>
     </w:p>
     <w:p>
       <w:pPr>
+        <w:pStyle w:val="ListParagraph"/>
+        <w:numPr>
+          <w:ilvl w:val="0"/>
+          <w:numId w:val="59"/>
+        </w:numPr>
+        <w:spacing w:after="80"/>
+        <w:rPr>
+          <w:rFonts w:ascii="Verdana" w:hAnsi="Verdana" w:cs="Arial"/>
+          <w:sz w:val="22"/>
+          <w:szCs w:val="22"/>
+          <w:lang w:val="en-NZ"/>
+        </w:rPr>
+      </w:pPr>
+      <w:r>
+        <w:rPr>
+          <w:rFonts w:ascii="Verdana" w:hAnsi="Verdana" w:cs="Arial"/>
+          <w:sz w:val="22"/>
+          <w:szCs w:val="22"/>
+          <w:lang w:val="en-NZ"/>
+        </w:rPr>
+        <w:t>Data management platforms: Azure Synapse, Microsoft Purview, Databricks, Snowflake</w:t>
+      </w:r>
+    </w:p>
+    <w:p>
+      <w:pPr>
+        <w:pStyle w:val="ListParagraph"/>
+        <w:numPr>
+          <w:ilvl w:val="0"/>
+          <w:numId w:val="59"/>
+        </w:numPr>
+        <w:spacing w:after="80"/>
+        <w:rPr>
+          <w:rFonts w:ascii="Verdana" w:hAnsi="Verdana" w:cs="Arial"/>
+          <w:sz w:val="22"/>
+          <w:szCs w:val="22"/>
+          <w:lang w:val="en-NZ"/>
+        </w:rPr>
+      </w:pPr>
+      <w:r>
+        <w:rPr>
+          <w:rFonts w:ascii="Verdana" w:hAnsi="Verdana" w:cs="Arial"/>
+          <w:sz w:val="22"/>
+          <w:szCs w:val="22"/>
+          <w:lang w:val="en-NZ"/>
+        </w:rPr>
+        <w:t>Performance dashboards and executive reporting</w:t>
+      </w:r>
+    </w:p>
+    <w:p>
+      <w:pPr>
+        <w:pStyle w:val="ListParagraph"/>
+        <w:numPr>
+          <w:ilvl w:val="0"/>
+          <w:numId w:val="59"/>
+        </w:numPr>
+        <w:spacing w:after="80"/>
+        <w:rPr>
+          <w:rFonts w:ascii="Verdana" w:hAnsi="Verdana" w:cs="Arial"/>
+          <w:sz w:val="22"/>
+          <w:szCs w:val="22"/>
+          <w:lang w:val="en-NZ"/>
+        </w:rPr>
+      </w:pPr>
+      <w:r>
+        <w:rPr>
+          <w:rFonts w:ascii="Verdana" w:hAnsi="Verdana" w:cs="Arial"/>
+          <w:sz w:val="22"/>
+          <w:szCs w:val="22"/>
+          <w:lang w:val="en-NZ"/>
+        </w:rPr>
+        <w:t>Embedding data-driven culture across the organisation</w:t>
+      </w:r>
+    </w:p>
+    <w:p>
+      <w:pPr>
+        <w:spacing w:after="80"/>
         <w:rPr>
           <w:rFonts w:ascii="Verdana" w:hAnsi="Verdana"/>
         </w:rPr>
@@ -1261,37 +1338,16 @@
     </w:p>
     <w:p>
       <w:pPr>
-        <w:pStyle w:val="Heading3"/>
-        <w:rPr>
-          <w:rStyle w:val="Emphasis"/>
-          <w:rFonts w:eastAsia="Times New Roman" w:cs="Times New Roman"/>
-          <w:color w:val="auto"/>
-          <w:sz w:val="28"/>
-          <w:szCs w:val="28"/>
+        <w:tabs>
+          <w:tab w:val="left" w:pos="2691"/>
+          <w:tab w:val="center" w:pos="5233"/>
+        </w:tabs>
+        <w:spacing w:after="20"/>
+        <w:rPr>
+          <w:rFonts w:ascii="Verdana" w:hAnsi="Verdana"/>
+          <w:b/>
+          <w:bCs/>
           <w:lang w:val="en-AU" w:eastAsia="en-AU"/>
-        </w:rPr>
-      </w:pPr>
-      <w:r>
-        <w:rPr>
-          <w:rStyle w:val="Emphasis"/>
-          <w:rFonts w:eastAsia="Times New Roman" w:cs="Times New Roman"/>
-          <w:color w:val="auto"/>
-          <w:sz w:val="28"/>
-          <w:szCs w:val="28"/>
-          <w:lang w:val="en-AU" w:eastAsia="en-AU"/>
-        </w:rPr>
-        <w:t>Executive Impact &amp; Accountability</w:t>
-      </w:r>
-    </w:p>
-    <w:p>
-      <w:pPr>
-        <w:pStyle w:val="NormalWeb"/>
-        <w:numPr>
-          <w:ilvl w:val="0"/>
-          <w:numId w:val="48"/>
-        </w:numPr>
-        <w:rPr>
-          <w:rFonts w:ascii="Verdana" w:hAnsi="Verdana"/>
         </w:rPr>
       </w:pPr>
       <w:r>
@@ -1302,15 +1358,15 @@
           <w:szCs w:val="22"/>
         </w:rPr>
         <w:drawing>
-          <wp:anchor distT="0" distB="0" distL="114300" distR="114300" simplePos="0" relativeHeight="251660288" behindDoc="0" locked="0" layoutInCell="1" allowOverlap="1" wp14:anchorId="02AC9CB1" wp14:editId="6F3BADA6">
+          <wp:anchor distT="0" distB="0" distL="114300" distR="114300" simplePos="0" relativeHeight="251660288" behindDoc="0" locked="0" layoutInCell="1" allowOverlap="1" wp14:anchorId="02AC9CB1" wp14:editId="4E25BA43">
             <wp:simplePos x="0" y="0"/>
             <wp:positionH relativeFrom="page">
-              <wp:align>left</wp:align>
+              <wp:posOffset>138430</wp:posOffset>
             </wp:positionH>
             <wp:positionV relativeFrom="paragraph">
-              <wp:posOffset>240017</wp:posOffset>
+              <wp:posOffset>244475</wp:posOffset>
             </wp:positionV>
-            <wp:extent cx="1099524" cy="4852491"/>
+            <wp:extent cx="1099185" cy="4852035"/>
             <wp:effectExtent l="38100" t="0" r="62865" b="43815"/>
             <wp:wrapSquare wrapText="bothSides"/>
             <wp:docPr id="8" name="Diagram 8" descr="SmartArt Process diagram">
@@ -1338,29 +1394,222 @@
       <w:r>
         <w:rPr>
           <w:rFonts w:ascii="Verdana" w:hAnsi="Verdana"/>
-        </w:rPr>
-        <w:t xml:space="preserve">Lead institution-level </w:t>
-      </w:r>
-      <w:r>
-        <w:rPr>
-          <w:rStyle w:val="Strong"/>
-          <w:rFonts w:ascii="Verdana" w:hAnsi="Verdana"/>
-        </w:rPr>
-        <w:t>business intelligence, data warehousing and analytics services</w:t>
-      </w:r>
-      <w:r>
-        <w:rPr>
-          <w:rFonts w:ascii="Verdana" w:hAnsi="Verdana"/>
-        </w:rPr>
-        <w:t xml:space="preserve"> supporting strategic planning, operational decision-making and performance monitoring.</w:t>
+          <w:b/>
+          <w:bCs/>
+          <w:lang w:val="en-AU" w:eastAsia="en-AU"/>
+        </w:rPr>
+        <w:t>Data Transformation &amp; Risk Reduction</w:t>
       </w:r>
     </w:p>
     <w:p>
       <w:pPr>
+        <w:pStyle w:val="ListParagraph"/>
+        <w:spacing w:after="40"/>
+        <w:ind w:left="283" w:hanging="170"/>
+        <w:rPr>
+          <w:rFonts w:ascii="Verdana" w:hAnsi="Verdana"/>
+          <w:lang w:val="en-AU" w:eastAsia="en-AU"/>
+        </w:rPr>
+      </w:pPr>
+      <w:r>
+        <w:rPr>
+          <w:rFonts w:ascii="Verdana" w:hAnsi="Verdana"/>
+          <w:lang w:val="en-AU" w:eastAsia="en-AU"/>
+        </w:rPr>
+        <w:t>•  Designed and led a data transformation strategy focused on reducing information risk, improving data integrity, and building executive confidence in reported outcomes.</w:t>
+      </w:r>
+    </w:p>
+    <w:p>
+      <w:pPr>
+        <w:pStyle w:val="ListParagraph"/>
+        <w:spacing w:after="40"/>
+        <w:ind w:left="283" w:hanging="170"/>
+        <w:rPr>
+          <w:rFonts w:ascii="Verdana" w:hAnsi="Verdana"/>
+          <w:lang w:val="en-AU" w:eastAsia="en-AU"/>
+        </w:rPr>
+      </w:pPr>
+      <w:r>
+        <w:rPr>
+          <w:rFonts w:ascii="Verdana" w:hAnsi="Verdana"/>
+          <w:lang w:val="en-AU" w:eastAsia="en-AU"/>
+        </w:rPr>
+        <w:t>•  Implemented enterprise data lifecycle controls — from acquisition and classification through to disposal — ensuring compliance with Queensland Privacy Act obligations and institutional governance requirements.</w:t>
+      </w:r>
+    </w:p>
+    <w:p>
+      <w:pPr>
+        <w:pStyle w:val="ListParagraph"/>
+        <w:spacing w:after="40"/>
+        <w:ind w:left="283" w:hanging="170"/>
+        <w:rPr>
+          <w:rFonts w:ascii="Verdana" w:hAnsi="Verdana"/>
+          <w:lang w:val="en-AU" w:eastAsia="en-AU"/>
+        </w:rPr>
+      </w:pPr>
+      <w:r>
+        <w:rPr>
+          <w:rFonts w:ascii="Verdana" w:hAnsi="Verdana"/>
+          <w:lang w:val="en-AU" w:eastAsia="en-AU"/>
+        </w:rPr>
+        <w:t>•  Embedded risk-aware data practices across academic and corporate portfolios, shifting the culture from reactive data management to proactive accountability and trust.</w:t>
+      </w:r>
+    </w:p>
+    <w:p>
+      <w:pPr>
+        <w:pStyle w:val="ListParagraph"/>
+        <w:spacing w:after="40"/>
+        <w:ind w:left="283" w:hanging="170"/>
+        <w:rPr>
+          <w:rFonts w:ascii="Verdana" w:hAnsi="Verdana"/>
+          <w:lang w:val="en-AU" w:eastAsia="en-AU"/>
+        </w:rPr>
+      </w:pPr>
+      <w:r>
+        <w:rPr>
+          <w:rFonts w:ascii="Verdana" w:hAnsi="Verdana"/>
+          <w:lang w:val="en-AU" w:eastAsia="en-AU"/>
+        </w:rPr>
+        <w:t>•  Led Microsoft Purview implementation to automate PII discovery and classification across all data sources using ML-based scanners, reducing exposure risk and enabling consistent governance at scale.</w:t>
+      </w:r>
+    </w:p>
+    <w:p>
+      <w:pPr>
+        <w:spacing w:after="20"/>
+        <w:rPr>
+          <w:rFonts w:ascii="Verdana" w:hAnsi="Verdana"/>
+          <w:b/>
+          <w:bCs/>
+          <w:lang w:val="en-AU" w:eastAsia="en-AU"/>
+        </w:rPr>
+      </w:pPr>
+      <w:r>
+        <w:rPr>
+          <w:rFonts w:ascii="Verdana" w:hAnsi="Verdana"/>
+          <w:b/>
+          <w:bCs/>
+          <w:lang w:val="en-AU" w:eastAsia="en-AU"/>
+        </w:rPr>
+        <w:t>Data Quality &amp; Continuous Improvement</w:t>
+      </w:r>
+    </w:p>
+    <w:p>
+      <w:pPr>
+        <w:pStyle w:val="ListParagraph"/>
+        <w:spacing w:after="40"/>
+        <w:ind w:left="283" w:hanging="170"/>
+        <w:rPr>
+          <w:rFonts w:ascii="Verdana" w:hAnsi="Verdana"/>
+          <w:lang w:val="en-AU" w:eastAsia="en-AU"/>
+        </w:rPr>
+      </w:pPr>
+      <w:r>
+        <w:rPr>
+          <w:rFonts w:ascii="Verdana" w:hAnsi="Verdana"/>
+          <w:lang w:val="en-AU" w:eastAsia="en-AU"/>
+        </w:rPr>
+        <w:t>•  Established data quality frameworks, ownership structures, and stewardship accountabilities across the enterprise, giving leaders clear visibility of data health and lineage.</w:t>
+      </w:r>
+    </w:p>
+    <w:p>
+      <w:pPr>
+        <w:pStyle w:val="ListParagraph"/>
+        <w:spacing w:after="40"/>
+        <w:ind w:left="283" w:hanging="170"/>
+        <w:rPr>
+          <w:rFonts w:ascii="Verdana" w:hAnsi="Verdana"/>
+          <w:lang w:val="en-AU" w:eastAsia="en-AU"/>
+        </w:rPr>
+      </w:pPr>
+      <w:r>
+        <w:rPr>
+          <w:rFonts w:ascii="Verdana" w:hAnsi="Verdana"/>
+          <w:lang w:val="en-AU" w:eastAsia="en-AU"/>
+        </w:rPr>
+        <w:t>•  Introduced medallion architecture patterns to strengthen assurance, lineage, and quality control at each stage of the data lifecycle.</w:t>
+      </w:r>
+    </w:p>
+    <w:p>
+      <w:pPr>
+        <w:pStyle w:val="ListParagraph"/>
+        <w:spacing w:after="40"/>
+        <w:ind w:left="283" w:hanging="170"/>
+        <w:rPr>
+          <w:rFonts w:ascii="Verdana" w:hAnsi="Verdana"/>
+          <w:lang w:val="en-AU" w:eastAsia="en-AU"/>
+        </w:rPr>
+      </w:pPr>
+      <w:r>
+        <w:rPr>
+          <w:rFonts w:ascii="Verdana" w:hAnsi="Verdana"/>
+          <w:lang w:val="en-AU" w:eastAsia="en-AU"/>
+        </w:rPr>
+        <w:t>•  Developed executive dashboards and performance reporting artefacts that translate complex institutional data into actionable, trustworthy management insight.</w:t>
+      </w:r>
+    </w:p>
+    <w:p>
+      <w:pPr>
+        <w:pStyle w:val="ListParagraph"/>
+        <w:spacing w:after="40"/>
+        <w:ind w:left="283" w:hanging="170"/>
+        <w:rPr>
+          <w:rStyle w:val="Emphasis"/>
+          <w:rFonts w:ascii="Verdana" w:hAnsi="Verdana"/>
+          <w:i w:val="0"/>
+          <w:iCs w:val="0"/>
+          <w:lang w:val="en-AU" w:eastAsia="en-AU"/>
+        </w:rPr>
+      </w:pPr>
+      <w:r>
+        <w:rPr>
+          <w:rFonts w:ascii="Verdana" w:hAnsi="Verdana"/>
+          <w:lang w:val="en-AU" w:eastAsia="en-AU"/>
+        </w:rPr>
+        <w:t>•  Defined metrics and KPIs to monitor data quality performance over time and drive continuous improvement across business units.</w:t>
+      </w:r>
+    </w:p>
+    <w:p>
+      <w:pPr>
+        <w:spacing w:after="20"/>
+        <w:rPr>
+          <w:rFonts w:ascii="Verdana" w:hAnsi="Verdana"/>
+          <w:b/>
+          <w:bCs/>
+          <w:lang w:val="en-AU" w:eastAsia="en-AU"/>
+        </w:rPr>
+      </w:pPr>
+      <w:r>
+        <w:rPr>
+          <w:rFonts w:ascii="Verdana" w:hAnsi="Verdana"/>
+          <w:b/>
+          <w:bCs/>
+          <w:lang w:val="en-AU" w:eastAsia="en-AU"/>
+        </w:rPr>
+        <w:t>Data Governance &amp; AI Readiness (Enterprise Portfolio Leadership)</w:t>
+      </w:r>
+    </w:p>
+    <w:p>
+      <w:pPr>
+        <w:pStyle w:val="NormalWeb"/>
+        <w:rPr>
+          <w:rFonts w:ascii="Verdana" w:hAnsi="Verdana"/>
+        </w:rPr>
+      </w:pPr>
+      <w:r>
+        <w:rPr>
+          <w:rStyle w:val="Emphasis"/>
+          <w:rFonts w:ascii="Verdana" w:hAnsi="Verdana"/>
+        </w:rPr>
+        <w:lastRenderedPageBreak/>
+        <w:t>Secondment / portfolio leadership alongside core BI &amp; DW accountabilities</w:t>
+      </w:r>
+    </w:p>
+    <w:p>
+      <w:pPr>
         <w:pStyle w:val="NormalWeb"/>
         <w:numPr>
           <w:ilvl w:val="0"/>
-          <w:numId w:val="48"/>
+          <w:numId w:val="50"/>
         </w:numPr>
         <w:rPr>
           <w:rFonts w:ascii="Verdana" w:hAnsi="Verdana"/>
@@ -1370,20 +1619,20 @@
         <w:rPr>
           <w:rFonts w:ascii="Verdana" w:hAnsi="Verdana"/>
         </w:rPr>
-        <w:t xml:space="preserve">Partner with senior academic and professional leaders to translate University strategy into </w:t>
+        <w:t xml:space="preserve">Led the </w:t>
       </w:r>
       <w:r>
         <w:rPr>
           <w:rStyle w:val="Strong"/>
           <w:rFonts w:ascii="Verdana" w:hAnsi="Verdana"/>
         </w:rPr>
-        <w:t>actionable insights, metrics and analytical narratives</w:t>
+        <w:t>end-to-end establishment of enterprise data governance foundations</w:t>
       </w:r>
       <w:r>
         <w:rPr>
           <w:rFonts w:ascii="Verdana" w:hAnsi="Verdana"/>
         </w:rPr>
-        <w:t>.</w:t>
+        <w:t>, positioning UniSC for responsible analytics and AI adoption.</w:t>
       </w:r>
     </w:p>
     <w:p>
@@ -1391,7 +1640,7 @@
         <w:pStyle w:val="NormalWeb"/>
         <w:numPr>
           <w:ilvl w:val="0"/>
-          <w:numId w:val="48"/>
+          <w:numId w:val="50"/>
         </w:numPr>
         <w:rPr>
           <w:rFonts w:ascii="Verdana" w:hAnsi="Verdana"/>
@@ -1401,15 +1650,15 @@
         <w:rPr>
           <w:rFonts w:ascii="Verdana" w:hAnsi="Verdana"/>
         </w:rPr>
-        <w:t>Build and lead high-performing, multi-disciplinary teams across data engineering, analytics and visualisation.</w:t>
+        <w:t>Delivered the University’s Microsoft Purview implementation to:</w:t>
       </w:r>
     </w:p>
     <w:p>
       <w:pPr>
         <w:pStyle w:val="NormalWeb"/>
         <w:numPr>
-          <w:ilvl w:val="0"/>
-          <w:numId w:val="48"/>
+          <w:ilvl w:val="1"/>
+          <w:numId w:val="50"/>
         </w:numPr>
         <w:rPr>
           <w:rFonts w:ascii="Verdana" w:hAnsi="Verdana"/>
@@ -1419,29 +1668,125 @@
         <w:rPr>
           <w:rFonts w:ascii="Verdana" w:hAnsi="Verdana"/>
         </w:rPr>
-        <w:t xml:space="preserve">Establish governance, platforms and operating models that </w:t>
+        <w:t xml:space="preserve">Automate </w:t>
       </w:r>
       <w:r>
         <w:rPr>
           <w:rStyle w:val="Strong"/>
           <w:rFonts w:ascii="Verdana" w:hAnsi="Verdana"/>
         </w:rPr>
-        <w:t>increase confidence in institutional reporting, planning and external submissions</w:t>
+        <w:t>PII discovery and classification</w:t>
       </w:r>
       <w:r>
         <w:rPr>
           <w:rFonts w:ascii="Verdana" w:hAnsi="Verdana"/>
         </w:rPr>
-        <w:t>.</w:t>
+        <w:t xml:space="preserve"> across </w:t>
+      </w:r>
+      <w:r>
+        <w:rPr>
+          <w:rFonts w:ascii="Verdana" w:hAnsi="Verdana"/>
+        </w:rPr>
+        <w:t>d</w:t>
+      </w:r>
+      <w:r>
+        <w:rPr>
+          <w:rFonts w:ascii="Verdana" w:hAnsi="Verdana"/>
+        </w:rPr>
+        <w:t>ata sources using ML-based scanners.</w:t>
       </w:r>
     </w:p>
     <w:p>
       <w:pPr>
+        <w:pStyle w:val="NormalWeb"/>
+        <w:numPr>
+          <w:ilvl w:val="1"/>
+          <w:numId w:val="50"/>
+        </w:numPr>
+        <w:rPr>
+          <w:rFonts w:ascii="Verdana" w:hAnsi="Verdana"/>
+        </w:rPr>
+      </w:pPr>
+      <w:r>
+        <w:rPr>
+          <w:rFonts w:ascii="Verdana" w:hAnsi="Verdana"/>
+        </w:rPr>
+        <w:t>Continued work to d</w:t>
+      </w:r>
+      <w:r>
+        <w:rPr>
+          <w:rFonts w:ascii="Verdana" w:hAnsi="Verdana"/>
+        </w:rPr>
+        <w:t xml:space="preserve">efine </w:t>
+      </w:r>
+      <w:r>
+        <w:rPr>
+          <w:rStyle w:val="Strong"/>
+          <w:rFonts w:ascii="Verdana" w:hAnsi="Verdana"/>
+        </w:rPr>
+        <w:t>data stewardship and governance domains</w:t>
+      </w:r>
+      <w:r>
+        <w:rPr>
+          <w:rFonts w:ascii="Verdana" w:hAnsi="Verdana"/>
+        </w:rPr>
+        <w:t xml:space="preserve"> in collaboration with Privacy, IT and business owners, aligned to QLD Privacy Act requirements.</w:t>
+      </w:r>
+    </w:p>
+    <w:p>
+      <w:pPr>
+        <w:pStyle w:val="NormalWeb"/>
+        <w:numPr>
+          <w:ilvl w:val="1"/>
+          <w:numId w:val="50"/>
+        </w:numPr>
+        <w:rPr>
+          <w:rFonts w:ascii="Verdana" w:hAnsi="Verdana"/>
+        </w:rPr>
+      </w:pPr>
+      <w:r>
+        <w:rPr>
+          <w:rFonts w:ascii="Verdana" w:hAnsi="Verdana"/>
+        </w:rPr>
+        <w:t>Establish governance controls and change management processes to mitigate risk in sensitive and executive-facing data environments.</w:t>
+      </w:r>
+    </w:p>
+    <w:p>
+      <w:pPr>
+        <w:pStyle w:val="NormalWeb"/>
+        <w:numPr>
+          <w:ilvl w:val="0"/>
+          <w:numId w:val="50"/>
+        </w:numPr>
+        <w:rPr>
+          <w:rFonts w:ascii="Verdana" w:hAnsi="Verdana"/>
+        </w:rPr>
+      </w:pPr>
+      <w:r>
+        <w:rPr>
+          <w:rFonts w:ascii="Verdana" w:hAnsi="Verdana"/>
+        </w:rPr>
+        <w:t xml:space="preserve">Positioned governance as an </w:t>
+      </w:r>
+      <w:r>
+        <w:rPr>
+          <w:rStyle w:val="Strong"/>
+          <w:rFonts w:ascii="Verdana" w:hAnsi="Verdana"/>
+        </w:rPr>
+        <w:t>enabler of trusted insight, planning confidence and executive assurance</w:t>
+      </w:r>
+      <w:r>
+        <w:rPr>
+          <w:rFonts w:ascii="Verdana" w:hAnsi="Verdana"/>
+        </w:rPr>
+        <w:t>, rather than a compliance-only function.</w:t>
+      </w:r>
+    </w:p>
+    <w:p>
+      <w:pPr>
         <w:pStyle w:val="Heading3"/>
         <w:rPr>
           <w:rFonts w:ascii="Verdana" w:hAnsi="Verdana"/>
-          <w:sz w:val="28"/>
-          <w:szCs w:val="28"/>
         </w:rPr>
       </w:pPr>
       <w:r>
@@ -1453,7 +1798,7 @@
           <w:szCs w:val="28"/>
           <w:lang w:val="en-AU" w:eastAsia="en-AU"/>
         </w:rPr>
-        <w:t>Enterprise Insights, Planning &amp; Decision Support</w:t>
+        <w:t>Platform, Architecture &amp; Capability Enablement</w:t>
       </w:r>
     </w:p>
     <w:p>
@@ -1461,7 +1806,7 @@
         <w:pStyle w:val="NormalWeb"/>
         <w:numPr>
           <w:ilvl w:val="0"/>
-          <w:numId w:val="49"/>
+          <w:numId w:val="51"/>
         </w:numPr>
         <w:rPr>
           <w:rFonts w:ascii="Verdana" w:hAnsi="Verdana"/>
@@ -1471,20 +1816,20 @@
         <w:rPr>
           <w:rFonts w:ascii="Verdana" w:hAnsi="Verdana"/>
         </w:rPr>
-        <w:t xml:space="preserve">Enable </w:t>
+        <w:t xml:space="preserve">Led the implementation and optimisation of </w:t>
       </w:r>
       <w:r>
         <w:rPr>
           <w:rStyle w:val="Strong"/>
           <w:rFonts w:ascii="Verdana" w:hAnsi="Verdana"/>
         </w:rPr>
-        <w:t>enterprise performance reporting and monitoring</w:t>
+        <w:t>Azure Synapse Analytics</w:t>
       </w:r>
       <w:r>
         <w:rPr>
           <w:rFonts w:ascii="Verdana" w:hAnsi="Verdana"/>
         </w:rPr>
-        <w:t>, supporting evidence-based decision-making, strategy development and business planning.</w:t>
+        <w:t xml:space="preserve"> as UniSC’s enterprise data warehousing platform.</w:t>
       </w:r>
     </w:p>
     <w:p>
@@ -1492,7 +1837,7 @@
         <w:pStyle w:val="NormalWeb"/>
         <w:numPr>
           <w:ilvl w:val="0"/>
-          <w:numId w:val="49"/>
+          <w:numId w:val="51"/>
         </w:numPr>
         <w:rPr>
           <w:rFonts w:ascii="Verdana" w:hAnsi="Verdana"/>
@@ -1502,20 +1847,20 @@
         <w:rPr>
           <w:rFonts w:ascii="Verdana" w:hAnsi="Verdana"/>
         </w:rPr>
-        <w:t xml:space="preserve">Lay foundations for </w:t>
+        <w:t xml:space="preserve">Introduced </w:t>
       </w:r>
       <w:r>
         <w:rPr>
           <w:rStyle w:val="Strong"/>
           <w:rFonts w:ascii="Verdana" w:hAnsi="Verdana"/>
         </w:rPr>
-        <w:t>student journey reporting</w:t>
+        <w:t>meta-driven data design</w:t>
       </w:r>
       <w:r>
         <w:rPr>
           <w:rFonts w:ascii="Verdana" w:hAnsi="Verdana"/>
         </w:rPr>
-        <w:t>, integrating enrolment, progression and outcomes data into coherent lifecycle views.</w:t>
+        <w:t xml:space="preserve"> to improve agility, scalability and responsiveness to changing institutional requirements.</w:t>
       </w:r>
     </w:p>
     <w:p>
@@ -1523,7 +1868,7 @@
         <w:pStyle w:val="NormalWeb"/>
         <w:numPr>
           <w:ilvl w:val="0"/>
-          <w:numId w:val="49"/>
+          <w:numId w:val="51"/>
         </w:numPr>
         <w:rPr>
           <w:rFonts w:ascii="Verdana" w:hAnsi="Verdana"/>
@@ -1533,20 +1878,20 @@
         <w:rPr>
           <w:rFonts w:ascii="Verdana" w:hAnsi="Verdana"/>
         </w:rPr>
-        <w:t xml:space="preserve">Support planning and forecasting conversations by delivering </w:t>
+        <w:t xml:space="preserve">Enabled advanced analytics and visualisation through </w:t>
       </w:r>
       <w:r>
         <w:rPr>
           <w:rStyle w:val="Strong"/>
           <w:rFonts w:ascii="Verdana" w:hAnsi="Verdana"/>
         </w:rPr>
-        <w:t>trusted, governed datasets and analytical models</w:t>
+        <w:t>Power BI</w:t>
       </w:r>
       <w:r>
         <w:rPr>
           <w:rFonts w:ascii="Verdana" w:hAnsi="Verdana"/>
         </w:rPr>
-        <w:t xml:space="preserve"> for load, demand and performance analysis.</w:t>
+        <w:t>, delivering consistent, trusted metrics and self-service insight capability.</w:t>
       </w:r>
     </w:p>
     <w:p>
@@ -1554,7 +1899,7 @@
         <w:pStyle w:val="NormalWeb"/>
         <w:numPr>
           <w:ilvl w:val="0"/>
-          <w:numId w:val="49"/>
+          <w:numId w:val="51"/>
         </w:numPr>
         <w:rPr>
           <w:rFonts w:ascii="Verdana" w:hAnsi="Verdana"/>
@@ -1564,52 +1909,12 @@
         <w:rPr>
           <w:rFonts w:ascii="Verdana" w:hAnsi="Verdana"/>
         </w:rPr>
-        <w:t xml:space="preserve">Shift organisational demand from static reporting to </w:t>
-      </w:r>
-      <w:r>
-        <w:rPr>
-          <w:rStyle w:val="Strong"/>
-          <w:rFonts w:ascii="Verdana" w:hAnsi="Verdana"/>
-        </w:rPr>
-        <w:t>insight-led analysis and executive decision support</w:t>
-      </w:r>
-      <w:r>
-        <w:rPr>
-          <w:rFonts w:ascii="Verdana" w:hAnsi="Verdana"/>
-        </w:rPr>
-        <w:t>.</w:t>
+        <w:t>Ensured analytics platforms and pipelines are robust, auditable and aligned to enterprise information management standards.</w:t>
       </w:r>
     </w:p>
     <w:p>
       <w:pPr>
-        <w:rPr>
-          <w:rStyle w:val="Emphasis"/>
-          <w:rFonts w:asciiTheme="majorHAnsi" w:hAnsiTheme="majorHAnsi"/>
-          <w:sz w:val="28"/>
-          <w:szCs w:val="28"/>
-          <w:lang w:val="en-AU" w:eastAsia="en-AU"/>
-        </w:rPr>
-      </w:pPr>
-      <w:r>
-        <w:rPr>
-          <w:rStyle w:val="Emphasis"/>
-          <w:sz w:val="28"/>
-          <w:szCs w:val="28"/>
-          <w:lang w:val="en-AU" w:eastAsia="en-AU"/>
-        </w:rPr>
-        <w:br w:type="page"/>
-      </w:r>
-    </w:p>
-    <w:p>
-      <w:pPr>
         <w:pStyle w:val="Heading3"/>
-        <w:rPr>
-          <w:rFonts w:ascii="Verdana" w:hAnsi="Verdana"/>
-          <w:sz w:val="28"/>
-          <w:szCs w:val="28"/>
-        </w:rPr>
-      </w:pPr>
-      <w:r>
         <w:rPr>
           <w:rStyle w:val="Emphasis"/>
           <w:rFonts w:eastAsia="Times New Roman" w:cs="Times New Roman"/>
@@ -1618,208 +1923,6 @@
           <w:szCs w:val="28"/>
           <w:lang w:val="en-AU" w:eastAsia="en-AU"/>
         </w:rPr>
-        <w:t>Data Governance &amp; AI Readiness (Enterprise Portfolio Leadership)</w:t>
-      </w:r>
-    </w:p>
-    <w:p>
-      <w:pPr>
-        <w:pStyle w:val="NormalWeb"/>
-        <w:rPr>
-          <w:rFonts w:ascii="Verdana" w:hAnsi="Verdana"/>
-        </w:rPr>
-      </w:pPr>
-      <w:r>
-        <w:rPr>
-          <w:rStyle w:val="Emphasis"/>
-          <w:rFonts w:ascii="Verdana" w:hAnsi="Verdana"/>
-        </w:rPr>
-        <w:t>Secondment / portfolio leadership alongside core BI &amp; DW accountabilities</w:t>
-      </w:r>
-    </w:p>
-    <w:p>
-      <w:pPr>
-        <w:pStyle w:val="NormalWeb"/>
-        <w:numPr>
-          <w:ilvl w:val="0"/>
-          <w:numId w:val="50"/>
-        </w:numPr>
-        <w:rPr>
-          <w:rFonts w:ascii="Verdana" w:hAnsi="Verdana"/>
-        </w:rPr>
-      </w:pPr>
-      <w:r>
-        <w:rPr>
-          <w:rFonts w:ascii="Verdana" w:hAnsi="Verdana"/>
-        </w:rPr>
-        <w:t xml:space="preserve">Led the </w:t>
-      </w:r>
-      <w:r>
-        <w:rPr>
-          <w:rStyle w:val="Strong"/>
-          <w:rFonts w:ascii="Verdana" w:hAnsi="Verdana"/>
-        </w:rPr>
-        <w:t>end-to-end establishment of enterprise data governance foundations</w:t>
-      </w:r>
-      <w:r>
-        <w:rPr>
-          <w:rFonts w:ascii="Verdana" w:hAnsi="Verdana"/>
-        </w:rPr>
-        <w:t>, positioning UniSC for responsible analytics and AI adoption.</w:t>
-      </w:r>
-    </w:p>
-    <w:p>
-      <w:pPr>
-        <w:pStyle w:val="NormalWeb"/>
-        <w:numPr>
-          <w:ilvl w:val="0"/>
-          <w:numId w:val="50"/>
-        </w:numPr>
-        <w:rPr>
-          <w:rFonts w:ascii="Verdana" w:hAnsi="Verdana"/>
-        </w:rPr>
-      </w:pPr>
-      <w:r>
-        <w:rPr>
-          <w:rFonts w:ascii="Verdana" w:hAnsi="Verdana"/>
-        </w:rPr>
-        <w:t>Delivered the University’s Microsoft Purview implementation to:</w:t>
-      </w:r>
-    </w:p>
-    <w:p>
-      <w:pPr>
-        <w:pStyle w:val="NormalWeb"/>
-        <w:numPr>
-          <w:ilvl w:val="1"/>
-          <w:numId w:val="50"/>
-        </w:numPr>
-        <w:rPr>
-          <w:rFonts w:ascii="Verdana" w:hAnsi="Verdana"/>
-        </w:rPr>
-      </w:pPr>
-      <w:r>
-        <w:rPr>
-          <w:rFonts w:ascii="Verdana" w:hAnsi="Verdana"/>
-        </w:rPr>
-        <w:t xml:space="preserve">Automate </w:t>
-      </w:r>
-      <w:r>
-        <w:rPr>
-          <w:rStyle w:val="Strong"/>
-          <w:rFonts w:ascii="Verdana" w:hAnsi="Verdana"/>
-        </w:rPr>
-        <w:t>PII discovery and classification</w:t>
-      </w:r>
-      <w:r>
-        <w:rPr>
-          <w:rFonts w:ascii="Verdana" w:hAnsi="Verdana"/>
-        </w:rPr>
-        <w:t xml:space="preserve"> across </w:t>
-      </w:r>
-      <w:r>
-        <w:rPr>
-          <w:rFonts w:ascii="Verdana" w:hAnsi="Verdana"/>
-        </w:rPr>
-        <w:t>d</w:t>
-      </w:r>
-      <w:r>
-        <w:rPr>
-          <w:rFonts w:ascii="Verdana" w:hAnsi="Verdana"/>
-        </w:rPr>
-        <w:t>ata sources using ML-based scanners.</w:t>
-      </w:r>
-    </w:p>
-    <w:p>
-      <w:pPr>
-        <w:pStyle w:val="NormalWeb"/>
-        <w:numPr>
-          <w:ilvl w:val="1"/>
-          <w:numId w:val="50"/>
-        </w:numPr>
-        <w:rPr>
-          <w:rFonts w:ascii="Verdana" w:hAnsi="Verdana"/>
-        </w:rPr>
-      </w:pPr>
-      <w:r>
-        <w:rPr>
-          <w:rFonts w:ascii="Verdana" w:hAnsi="Verdana"/>
-        </w:rPr>
-        <w:t>Continued work to d</w:t>
-      </w:r>
-      <w:r>
-        <w:rPr>
-          <w:rFonts w:ascii="Verdana" w:hAnsi="Verdana"/>
-        </w:rPr>
-        <w:t xml:space="preserve">efine </w:t>
-      </w:r>
-      <w:r>
-        <w:rPr>
-          <w:rStyle w:val="Strong"/>
-          <w:rFonts w:ascii="Verdana" w:hAnsi="Verdana"/>
-        </w:rPr>
-        <w:t>data stewardship and governance domains</w:t>
-      </w:r>
-      <w:r>
-        <w:rPr>
-          <w:rFonts w:ascii="Verdana" w:hAnsi="Verdana"/>
-        </w:rPr>
-        <w:t xml:space="preserve"> in collaboration with Privacy, IT and business owners, aligned to QLD Privacy Act requirements.</w:t>
-      </w:r>
-    </w:p>
-    <w:p>
-      <w:pPr>
-        <w:pStyle w:val="NormalWeb"/>
-        <w:numPr>
-          <w:ilvl w:val="1"/>
-          <w:numId w:val="50"/>
-        </w:numPr>
-        <w:rPr>
-          <w:rFonts w:ascii="Verdana" w:hAnsi="Verdana"/>
-        </w:rPr>
-      </w:pPr>
-      <w:r>
-        <w:rPr>
-          <w:rFonts w:ascii="Verdana" w:hAnsi="Verdana"/>
-        </w:rPr>
-        <w:t>Establish governance controls and change management processes to mitigate risk in sensitive and executive-facing data environments.</w:t>
-      </w:r>
-    </w:p>
-    <w:p>
-      <w:pPr>
-        <w:pStyle w:val="NormalWeb"/>
-        <w:numPr>
-          <w:ilvl w:val="0"/>
-          <w:numId w:val="50"/>
-        </w:numPr>
-        <w:rPr>
-          <w:rFonts w:ascii="Verdana" w:hAnsi="Verdana"/>
-        </w:rPr>
-      </w:pPr>
-      <w:r>
-        <w:rPr>
-          <w:rFonts w:ascii="Verdana" w:hAnsi="Verdana"/>
-        </w:rPr>
-        <w:t xml:space="preserve">Positioned governance as an </w:t>
-      </w:r>
-      <w:r>
-        <w:rPr>
-          <w:rStyle w:val="Strong"/>
-          <w:rFonts w:ascii="Verdana" w:hAnsi="Verdana"/>
-        </w:rPr>
-        <w:t>enabler of trusted insight, planning confidence and executive assurance</w:t>
-      </w:r>
-      <w:r>
-        <w:rPr>
-          <w:rFonts w:ascii="Verdana" w:hAnsi="Verdana"/>
-        </w:rPr>
-        <w:t>, rather than a compliance-only function.</w:t>
-      </w:r>
-    </w:p>
-    <w:p>
-      <w:pPr>
-        <w:pStyle w:val="Heading3"/>
-        <w:rPr>
-          <w:rFonts w:ascii="Verdana" w:hAnsi="Verdana"/>
-        </w:rPr>
       </w:pPr>
       <w:r>
         <w:rPr>
@@ -1830,7 +1933,7 @@
           <w:szCs w:val="28"/>
           <w:lang w:val="en-AU" w:eastAsia="en-AU"/>
         </w:rPr>
-        <w:t>Platform, Architecture &amp; Capability Enablement</w:t>
+        <w:t>Leadership, Culture &amp; Stakeholder Engagement</w:t>
       </w:r>
     </w:p>
     <w:p>
@@ -1838,7 +1941,7 @@
         <w:pStyle w:val="NormalWeb"/>
         <w:numPr>
           <w:ilvl w:val="0"/>
-          <w:numId w:val="51"/>
+          <w:numId w:val="52"/>
         </w:numPr>
         <w:rPr>
           <w:rFonts w:ascii="Verdana" w:hAnsi="Verdana"/>
@@ -1848,34 +1951,20 @@
         <w:rPr>
           <w:rFonts w:ascii="Verdana" w:hAnsi="Verdana"/>
         </w:rPr>
-        <w:t xml:space="preserve">Led the implementation and optimisation of </w:t>
+        <w:t xml:space="preserve">Recruited, coached and led senior data engineers and visualisation specialists, fostering a </w:t>
       </w:r>
       <w:r>
         <w:rPr>
           <w:rStyle w:val="Strong"/>
           <w:rFonts w:ascii="Verdana" w:hAnsi="Verdana"/>
         </w:rPr>
-        <w:t>Azure Synapse Analytics</w:t>
+        <w:t>collaborative, high-performing analytics team</w:t>
       </w:r>
       <w:r>
         <w:rPr>
           <w:rFonts w:ascii="Verdana" w:hAnsi="Verdana"/>
         </w:rPr>
-        <w:t xml:space="preserve"> as </w:t>
-      </w:r>
-      <w:proofErr w:type="spellStart"/>
-      <w:r>
-        <w:rPr>
-          <w:rFonts w:ascii="Verdana" w:hAnsi="Verdana"/>
-        </w:rPr>
-        <w:t>UniSC’s</w:t>
-      </w:r>
-      <w:proofErr w:type="spellEnd"/>
-      <w:r>
-        <w:rPr>
-          <w:rFonts w:ascii="Verdana" w:hAnsi="Verdana"/>
-        </w:rPr>
-        <w:t xml:space="preserve"> enterprise data warehousing platform.</w:t>
+        <w:t>.</w:t>
       </w:r>
     </w:p>
     <w:p>
@@ -1883,7 +1972,7 @@
         <w:pStyle w:val="NormalWeb"/>
         <w:numPr>
           <w:ilvl w:val="0"/>
-          <w:numId w:val="51"/>
+          <w:numId w:val="52"/>
         </w:numPr>
         <w:rPr>
           <w:rFonts w:ascii="Verdana" w:hAnsi="Verdana"/>
@@ -1893,20 +1982,7 @@
         <w:rPr>
           <w:rFonts w:ascii="Verdana" w:hAnsi="Verdana"/>
         </w:rPr>
-        <w:t xml:space="preserve">Introduced </w:t>
-      </w:r>
-      <w:r>
-        <w:rPr>
-          <w:rStyle w:val="Strong"/>
-          <w:rFonts w:ascii="Verdana" w:hAnsi="Verdana"/>
-        </w:rPr>
-        <w:t>meta-driven data design</w:t>
-      </w:r>
-      <w:r>
-        <w:rPr>
-          <w:rFonts w:ascii="Verdana" w:hAnsi="Verdana"/>
-        </w:rPr>
-        <w:t xml:space="preserve"> to improve agility, scalability and responsiveness to changing institutional requirements.</w:t>
+        <w:t>Acted as a senior point of engagement for academic, operational and executive stakeholders, balancing competing priorities and expectations.</w:t>
       </w:r>
     </w:p>
     <w:p>
@@ -1914,7 +1990,7 @@
         <w:pStyle w:val="NormalWeb"/>
         <w:numPr>
           <w:ilvl w:val="0"/>
-          <w:numId w:val="51"/>
+          <w:numId w:val="52"/>
         </w:numPr>
         <w:rPr>
           <w:rFonts w:ascii="Verdana" w:hAnsi="Verdana"/>
@@ -1924,20 +2000,20 @@
         <w:rPr>
           <w:rFonts w:ascii="Verdana" w:hAnsi="Verdana"/>
         </w:rPr>
-        <w:t xml:space="preserve">Enabled advanced analytics and visualisation through </w:t>
+        <w:t xml:space="preserve">Championed an </w:t>
       </w:r>
       <w:r>
         <w:rPr>
           <w:rStyle w:val="Strong"/>
           <w:rFonts w:ascii="Verdana" w:hAnsi="Verdana"/>
         </w:rPr>
-        <w:t>Power BI</w:t>
+        <w:t>insight-driven culture</w:t>
       </w:r>
       <w:r>
         <w:rPr>
           <w:rFonts w:ascii="Verdana" w:hAnsi="Verdana"/>
         </w:rPr>
-        <w:t>, delivering consistent, trusted metrics and self-service insight capability.</w:t>
+        <w:t>, embedding analytics capability across the University through partnership, influence and clarity of purpose.</w:t>
       </w:r>
     </w:p>
     <w:p>
@@ -1945,7 +2021,7 @@
         <w:pStyle w:val="NormalWeb"/>
         <w:numPr>
           <w:ilvl w:val="0"/>
-          <w:numId w:val="51"/>
+          <w:numId w:val="52"/>
         </w:numPr>
         <w:rPr>
           <w:rFonts w:ascii="Verdana" w:hAnsi="Verdana"/>
@@ -1955,7 +2031,7 @@
         <w:rPr>
           <w:rFonts w:ascii="Verdana" w:hAnsi="Verdana"/>
         </w:rPr>
-        <w:t>Ensured analytics platforms and pipelines are robust, auditable and aligned to enterprise information management standards.</w:t>
+        <w:t>Contributed to IAU leadership forums, supporting the Chief Data Officer in advancing the Unit’s strategic objectives.</w:t>
       </w:r>
     </w:p>
     <w:p>
@@ -1979,128 +2055,6 @@
           <w:szCs w:val="28"/>
           <w:lang w:val="en-AU" w:eastAsia="en-AU"/>
         </w:rPr>
-        <w:t>Leadership, Culture &amp; Stakeholder Engagement</w:t>
-      </w:r>
-    </w:p>
-    <w:p>
-      <w:pPr>
-        <w:pStyle w:val="NormalWeb"/>
-        <w:numPr>
-          <w:ilvl w:val="0"/>
-          <w:numId w:val="52"/>
-        </w:numPr>
-        <w:rPr>
-          <w:rFonts w:ascii="Verdana" w:hAnsi="Verdana"/>
-        </w:rPr>
-      </w:pPr>
-      <w:r>
-        <w:rPr>
-          <w:rFonts w:ascii="Verdana" w:hAnsi="Verdana"/>
-        </w:rPr>
-        <w:t xml:space="preserve">Recruited, coached and led senior data engineers and visualisation specialists, fostering a </w:t>
-      </w:r>
-      <w:r>
-        <w:rPr>
-          <w:rStyle w:val="Strong"/>
-          <w:rFonts w:ascii="Verdana" w:hAnsi="Verdana"/>
-        </w:rPr>
-        <w:t>collaborative, high-performing analytics team</w:t>
-      </w:r>
-      <w:r>
-        <w:rPr>
-          <w:rFonts w:ascii="Verdana" w:hAnsi="Verdana"/>
-        </w:rPr>
-        <w:t>.</w:t>
-      </w:r>
-    </w:p>
-    <w:p>
-      <w:pPr>
-        <w:pStyle w:val="NormalWeb"/>
-        <w:numPr>
-          <w:ilvl w:val="0"/>
-          <w:numId w:val="52"/>
-        </w:numPr>
-        <w:rPr>
-          <w:rFonts w:ascii="Verdana" w:hAnsi="Verdana"/>
-        </w:rPr>
-      </w:pPr>
-      <w:r>
-        <w:rPr>
-          <w:rFonts w:ascii="Verdana" w:hAnsi="Verdana"/>
-        </w:rPr>
-        <w:t>Acted as a senior point of engagement for academic, operational and executive stakeholders, balancing competing priorities and expectations.</w:t>
-      </w:r>
-    </w:p>
-    <w:p>
-      <w:pPr>
-        <w:pStyle w:val="NormalWeb"/>
-        <w:numPr>
-          <w:ilvl w:val="0"/>
-          <w:numId w:val="52"/>
-        </w:numPr>
-        <w:rPr>
-          <w:rFonts w:ascii="Verdana" w:hAnsi="Verdana"/>
-        </w:rPr>
-      </w:pPr>
-      <w:r>
-        <w:rPr>
-          <w:rFonts w:ascii="Verdana" w:hAnsi="Verdana"/>
-        </w:rPr>
-        <w:t xml:space="preserve">Championed an </w:t>
-      </w:r>
-      <w:r>
-        <w:rPr>
-          <w:rStyle w:val="Strong"/>
-          <w:rFonts w:ascii="Verdana" w:hAnsi="Verdana"/>
-        </w:rPr>
-        <w:t>insight-driven culture</w:t>
-      </w:r>
-      <w:r>
-        <w:rPr>
-          <w:rFonts w:ascii="Verdana" w:hAnsi="Verdana"/>
-        </w:rPr>
-        <w:t>, embedding analytics capability across the University through partnership, influence and clarity of purpose.</w:t>
-      </w:r>
-    </w:p>
-    <w:p>
-      <w:pPr>
-        <w:pStyle w:val="NormalWeb"/>
-        <w:numPr>
-          <w:ilvl w:val="0"/>
-          <w:numId w:val="52"/>
-        </w:numPr>
-        <w:rPr>
-          <w:rFonts w:ascii="Verdana" w:hAnsi="Verdana"/>
-        </w:rPr>
-      </w:pPr>
-      <w:r>
-        <w:rPr>
-          <w:rFonts w:ascii="Verdana" w:hAnsi="Verdana"/>
-        </w:rPr>
-        <w:t>Contributed to IAU leadership forums, supporting the Chief Data Officer in advancing the Unit’s strategic objectives.</w:t>
-      </w:r>
-    </w:p>
-    <w:p>
-      <w:pPr>
-        <w:pStyle w:val="Heading3"/>
-        <w:rPr>
-          <w:rStyle w:val="Emphasis"/>
-          <w:rFonts w:eastAsia="Times New Roman" w:cs="Times New Roman"/>
-          <w:color w:val="auto"/>
-          <w:sz w:val="28"/>
-          <w:szCs w:val="28"/>
-          <w:lang w:val="en-AU" w:eastAsia="en-AU"/>
-        </w:rPr>
-      </w:pPr>
-      <w:r>
-        <w:rPr>
-          <w:rStyle w:val="Emphasis"/>
-          <w:rFonts w:eastAsia="Times New Roman" w:cs="Times New Roman"/>
-          <w:color w:val="auto"/>
-          <w:sz w:val="28"/>
-          <w:szCs w:val="28"/>
-          <w:lang w:val="en-AU" w:eastAsia="en-AU"/>
-        </w:rPr>
         <w:t>Core Platforms &amp; Methods</w:t>
       </w:r>
     </w:p>
@@ -2146,6 +2100,13 @@
           <w:lang w:val="en-AU" w:eastAsia="en-US"/>
         </w:rPr>
       </w:pPr>
+      <w:r>
+        <w:rPr>
+          <w:rFonts w:ascii="Verdana" w:hAnsi="Verdana"/>
+          <w:lang w:val="en-AU" w:eastAsia="en-US"/>
+        </w:rPr>
+        <w:br w:type="page"/>
+      </w:r>
     </w:p>
     <w:p>
       <w:pPr>
@@ -2194,7 +2155,6 @@
         </w:rPr>
         <w:t>–</w:t>
       </w:r>
-      <w:proofErr w:type="spellStart"/>
       <w:r>
         <w:rPr>
           <w:rFonts w:ascii="Verdana" w:hAnsi="Verdana" w:cs="Arial"/>
@@ -2204,19 +2164,7 @@
           <w:szCs w:val="22"/>
           <w:lang w:eastAsia="en-US"/>
         </w:rPr>
-        <w:t>Te</w:t>
-      </w:r>
-      <w:proofErr w:type="spellEnd"/>
-      <w:r>
-        <w:rPr>
-          <w:rFonts w:ascii="Verdana" w:hAnsi="Verdana" w:cs="Arial"/>
-          <w:b/>
-          <w:bCs/>
-          <w:sz w:val="22"/>
-          <w:szCs w:val="22"/>
-          <w:lang w:eastAsia="en-US"/>
-        </w:rPr>
-        <w:t xml:space="preserve"> Whatu Ora Health New Zealand</w:t>
+        <w:t>Te Whatu Ora Health New Zealand</w:t>
       </w:r>
     </w:p>
     <w:p>
@@ -2621,25 +2569,7 @@
           <w:sz w:val="22"/>
           <w:szCs w:val="22"/>
         </w:rPr>
-        <w:t xml:space="preserve">Utilized </w:t>
-      </w:r>
-      <w:proofErr w:type="spellStart"/>
-      <w:r>
-        <w:rPr>
-          <w:rFonts w:ascii="Verdana" w:hAnsi="Verdana" w:cs="Arial"/>
-          <w:sz w:val="22"/>
-          <w:szCs w:val="22"/>
-        </w:rPr>
-        <w:t>dbt</w:t>
-      </w:r>
-      <w:proofErr w:type="spellEnd"/>
-      <w:r>
-        <w:rPr>
-          <w:rFonts w:ascii="Verdana" w:hAnsi="Verdana" w:cs="Arial"/>
-          <w:sz w:val="22"/>
-          <w:szCs w:val="22"/>
-        </w:rPr>
-        <w:t xml:space="preserve"> for efficient data transformation, handling data sourced from Snowflake. This streamlined the data flow and improved the quality of data for analysis.</w:t>
+        <w:t>Utilized dbt for efficient data transformation, handling data sourced from Snowflake. This streamlined the data flow and improved the quality of data for analysis.</w:t>
       </w:r>
     </w:p>
     <w:p>
@@ -2889,7 +2819,6 @@
           <w:szCs w:val="22"/>
         </w:rPr>
       </w:pPr>
-      <w:proofErr w:type="spellStart"/>
       <w:r>
         <w:rPr>
           <w:rFonts w:ascii="Verdana" w:hAnsi="Verdana" w:cs="Arial"/>
@@ -2898,7 +2827,6 @@
         </w:rPr>
         <w:t>dbt</w:t>
       </w:r>
-      <w:proofErr w:type="spellEnd"/>
     </w:p>
     <w:p>
       <w:pPr>
@@ -2975,6 +2903,7 @@
           <w:szCs w:val="22"/>
           <w:lang w:val="en-NZ" w:eastAsia="en-US"/>
         </w:rPr>
+        <w:lastRenderedPageBreak/>
         <w:t xml:space="preserve">Employer </w:t>
       </w:r>
       <w:r>
@@ -3040,31 +2969,7 @@
           <w:szCs w:val="22"/>
           <w:lang w:val="en-NZ" w:eastAsia="en-US"/>
         </w:rPr>
-        <w:t xml:space="preserve">Workforce Development Council, </w:t>
-      </w:r>
-      <w:proofErr w:type="spellStart"/>
-      <w:r>
-        <w:rPr>
-          <w:rFonts w:ascii="Verdana" w:hAnsi="Verdana" w:cs="Arial"/>
-          <w:b/>
-          <w:bCs/>
-          <w:sz w:val="22"/>
-          <w:szCs w:val="22"/>
-          <w:lang w:val="en-NZ" w:eastAsia="en-US"/>
-        </w:rPr>
-        <w:t>Ohu</w:t>
-      </w:r>
-      <w:proofErr w:type="spellEnd"/>
-      <w:r>
-        <w:rPr>
-          <w:rFonts w:ascii="Verdana" w:hAnsi="Verdana" w:cs="Arial"/>
-          <w:b/>
-          <w:bCs/>
-          <w:sz w:val="22"/>
-          <w:szCs w:val="22"/>
-          <w:lang w:val="en-NZ" w:eastAsia="en-US"/>
-        </w:rPr>
-        <w:t xml:space="preserve"> Mahi</w:t>
+        <w:t>Workforce Development Council, Ohu Mahi</w:t>
       </w:r>
       <w:r>
         <w:rPr>
@@ -3341,25 +3246,7 @@
           <w:sz w:val="22"/>
           <w:szCs w:val="22"/>
         </w:rPr>
-        <w:t xml:space="preserve">Utilizing Azure Synapse and Databricks Delta Live Tables, as well as </w:t>
-      </w:r>
-      <w:proofErr w:type="spellStart"/>
-      <w:r>
-        <w:rPr>
-          <w:rFonts w:ascii="Verdana" w:hAnsi="Verdana" w:cs="Arial"/>
-          <w:sz w:val="22"/>
-          <w:szCs w:val="22"/>
-        </w:rPr>
-        <w:t>PowerBI</w:t>
-      </w:r>
-      <w:proofErr w:type="spellEnd"/>
-      <w:r>
-        <w:rPr>
-          <w:rFonts w:ascii="Verdana" w:hAnsi="Verdana" w:cs="Arial"/>
-          <w:sz w:val="22"/>
-          <w:szCs w:val="22"/>
-        </w:rPr>
-        <w:t xml:space="preserve"> dashboards, to extract insights from the Shared Data Platform</w:t>
+        <w:t>Utilizing Azure Synapse and Databricks Delta Live Tables, as well as PowerBI dashboards, to extract insights from the Shared Data Platform</w:t>
       </w:r>
     </w:p>
     <w:p>
@@ -3475,25 +3362,7 @@
           <w:sz w:val="22"/>
           <w:szCs w:val="22"/>
         </w:rPr>
-        <w:t xml:space="preserve">Implementing overnight </w:t>
-      </w:r>
-      <w:proofErr w:type="spellStart"/>
-      <w:r>
-        <w:rPr>
-          <w:rFonts w:ascii="Verdana" w:hAnsi="Verdana" w:cs="Arial"/>
-          <w:sz w:val="22"/>
-          <w:szCs w:val="22"/>
-        </w:rPr>
-        <w:t>chron</w:t>
-      </w:r>
-      <w:proofErr w:type="spellEnd"/>
-      <w:r>
-        <w:rPr>
-          <w:rFonts w:ascii="Verdana" w:hAnsi="Verdana" w:cs="Arial"/>
-          <w:sz w:val="22"/>
-          <w:szCs w:val="22"/>
-        </w:rPr>
-        <w:t xml:space="preserve"> jobs to deliver a Type 2 data warehouse in both non-prod and prod </w:t>
+        <w:t xml:space="preserve">Implementing overnight chron jobs to deliver a Type 2 data warehouse in both non-prod and prod </w:t>
       </w:r>
       <w:r>
         <w:rPr>
@@ -3601,25 +3470,7 @@
           <w:sz w:val="22"/>
           <w:szCs w:val="22"/>
         </w:rPr>
-        <w:t xml:space="preserve">Driving the growth of data capabilities within the team and wider </w:t>
-      </w:r>
-      <w:proofErr w:type="spellStart"/>
-      <w:r>
-        <w:rPr>
-          <w:rFonts w:ascii="Verdana" w:hAnsi="Verdana" w:cs="Arial"/>
-          <w:sz w:val="22"/>
-          <w:szCs w:val="22"/>
-        </w:rPr>
-        <w:t>Ohu</w:t>
-      </w:r>
-      <w:proofErr w:type="spellEnd"/>
-      <w:r>
-        <w:rPr>
-          <w:rFonts w:ascii="Verdana" w:hAnsi="Verdana" w:cs="Arial"/>
-          <w:sz w:val="22"/>
-          <w:szCs w:val="22"/>
-        </w:rPr>
-        <w:t xml:space="preserve"> Mahi.</w:t>
+        <w:t>Driving the growth of data capabilities within the team and wider Ohu Mahi.</w:t>
       </w:r>
     </w:p>
     <w:p>
@@ -3724,25 +3575,7 @@
           <w:sz w:val="22"/>
           <w:szCs w:val="22"/>
         </w:rPr>
-        <w:t xml:space="preserve">Growing the data capabilities of the team and wider </w:t>
-      </w:r>
-      <w:proofErr w:type="spellStart"/>
-      <w:r>
-        <w:rPr>
-          <w:rFonts w:ascii="Verdana" w:hAnsi="Verdana" w:cs="Arial"/>
-          <w:sz w:val="22"/>
-          <w:szCs w:val="22"/>
-        </w:rPr>
-        <w:t>Ohu</w:t>
-      </w:r>
-      <w:proofErr w:type="spellEnd"/>
-      <w:r>
-        <w:rPr>
-          <w:rFonts w:ascii="Verdana" w:hAnsi="Verdana" w:cs="Arial"/>
-          <w:sz w:val="22"/>
-          <w:szCs w:val="22"/>
-        </w:rPr>
-        <w:t xml:space="preserve"> Mahi through the establishment of a Data Community of Practice and delivery of data literacy and R training as a Data Carpenter certified instructor.</w:t>
+        <w:t>Growing the data capabilities of the team and wider Ohu Mahi through the establishment of a Data Community of Practice and delivery of data literacy and R training as a Data Carpenter certified instructor.</w:t>
       </w:r>
     </w:p>
     <w:p>
@@ -3771,25 +3604,7 @@
           <w:sz w:val="22"/>
           <w:szCs w:val="22"/>
         </w:rPr>
-        <w:t xml:space="preserve">Muka </w:t>
-      </w:r>
-      <w:proofErr w:type="spellStart"/>
-      <w:r>
-        <w:rPr>
-          <w:rFonts w:ascii="Verdana" w:hAnsi="Verdana" w:cs="Arial"/>
-          <w:sz w:val="22"/>
-          <w:szCs w:val="22"/>
-        </w:rPr>
-        <w:t>Tangata</w:t>
-      </w:r>
-      <w:proofErr w:type="spellEnd"/>
-      <w:r>
-        <w:rPr>
-          <w:rFonts w:ascii="Verdana" w:hAnsi="Verdana" w:cs="Arial"/>
-          <w:sz w:val="22"/>
-          <w:szCs w:val="22"/>
-        </w:rPr>
-        <w:t xml:space="preserve"> CE, Jeremy Baker</w:t>
+        <w:t>Muka Tangata CE, Jeremy Baker</w:t>
       </w:r>
       <w:r>
         <w:rPr>
@@ -3876,6 +3691,7 @@
           <w:szCs w:val="22"/>
           <w:lang w:val="en-NZ" w:eastAsia="en-US"/>
         </w:rPr>
+        <w:lastRenderedPageBreak/>
         <w:t xml:space="preserve">Employer - Ministry of </w:t>
       </w:r>
       <w:r>
@@ -4036,43 +3852,7 @@
           <w:sz w:val="22"/>
           <w:szCs w:val="22"/>
         </w:rPr>
-        <w:t xml:space="preserve">I have been contributing to the architectural development of database solutions, with a focus on creating high-integrity datasets. I have been leading the process change and writing the code pipeline using Azure </w:t>
-      </w:r>
-      <w:proofErr w:type="spellStart"/>
-      <w:r>
-        <w:rPr>
-          <w:rFonts w:ascii="Verdana" w:hAnsi="Verdana" w:cs="Arial"/>
-          <w:sz w:val="22"/>
-          <w:szCs w:val="22"/>
-        </w:rPr>
-        <w:t>databricks</w:t>
-      </w:r>
-      <w:proofErr w:type="spellEnd"/>
-      <w:r>
-        <w:rPr>
-          <w:rFonts w:ascii="Verdana" w:hAnsi="Verdana" w:cs="Arial"/>
-          <w:sz w:val="22"/>
-          <w:szCs w:val="22"/>
-        </w:rPr>
-        <w:t xml:space="preserve"> and R </w:t>
-      </w:r>
-      <w:proofErr w:type="gramStart"/>
-      <w:r>
-        <w:rPr>
-          <w:rFonts w:ascii="Verdana" w:hAnsi="Verdana" w:cs="Arial"/>
-          <w:sz w:val="22"/>
-          <w:szCs w:val="22"/>
-        </w:rPr>
-        <w:t>Studio, and</w:t>
-      </w:r>
-      <w:proofErr w:type="gramEnd"/>
-      <w:r>
-        <w:rPr>
-          <w:rFonts w:ascii="Verdana" w:hAnsi="Verdana" w:cs="Arial"/>
-          <w:sz w:val="22"/>
-          <w:szCs w:val="22"/>
-        </w:rPr>
-        <w:t xml:space="preserve"> have been managing stakeholders' requirements and priorities in Agile sprints effectively. I have also been responsible for the collation of data, and analysis and problem resolution for new information processes or reporting needs.</w:t>
+        <w:t>I have been contributing to the architectural development of database solutions, with a focus on creating high-integrity datasets. I have been leading the process change and writing the code pipeline using Azure databricks and R Studio, and have been managing stakeholders' requirements and priorities in Agile sprints effectively. I have also been responsible for the collation of data, and analysis and problem resolution for new information processes or reporting needs.</w:t>
       </w:r>
     </w:p>
     <w:p>
@@ -4400,25 +4180,7 @@
           <w:sz w:val="22"/>
           <w:szCs w:val="22"/>
         </w:rPr>
-        <w:t xml:space="preserve">Developing business strategies based on statistical and machine learning </w:t>
-      </w:r>
-      <w:proofErr w:type="spellStart"/>
-      <w:r>
-        <w:rPr>
-          <w:rFonts w:ascii="Verdana" w:hAnsi="Verdana" w:cs="Arial"/>
-          <w:sz w:val="22"/>
-          <w:szCs w:val="22"/>
-        </w:rPr>
-        <w:t>modeling</w:t>
-      </w:r>
-      <w:proofErr w:type="spellEnd"/>
-      <w:r>
-        <w:rPr>
-          <w:rFonts w:ascii="Verdana" w:hAnsi="Verdana" w:cs="Arial"/>
-          <w:sz w:val="22"/>
-          <w:szCs w:val="22"/>
-        </w:rPr>
-        <w:t>.</w:t>
+        <w:t>Developing business strategies based on statistical and machine learning modeling.</w:t>
       </w:r>
     </w:p>
     <w:p>
@@ -4591,25 +4353,7 @@
           <w:sz w:val="22"/>
           <w:szCs w:val="22"/>
         </w:rPr>
-        <w:t xml:space="preserve">Developed effective business strategies using statistical and machine learning </w:t>
-      </w:r>
-      <w:proofErr w:type="spellStart"/>
-      <w:r>
-        <w:rPr>
-          <w:rFonts w:ascii="Verdana" w:hAnsi="Verdana" w:cs="Arial"/>
-          <w:sz w:val="22"/>
-          <w:szCs w:val="22"/>
-        </w:rPr>
-        <w:t>modeling</w:t>
-      </w:r>
-      <w:proofErr w:type="spellEnd"/>
-      <w:r>
-        <w:rPr>
-          <w:rFonts w:ascii="Verdana" w:hAnsi="Verdana" w:cs="Arial"/>
-          <w:sz w:val="22"/>
-          <w:szCs w:val="22"/>
-        </w:rPr>
-        <w:t>.</w:t>
+        <w:t>Developed effective business strategies using statistical and machine learning modeling.</w:t>
       </w:r>
     </w:p>
     <w:p>
@@ -4712,6 +4456,7 @@
           <w:szCs w:val="22"/>
           <w:lang w:val="en-NZ" w:eastAsia="en-US"/>
         </w:rPr>
+        <w:lastRenderedPageBreak/>
         <w:t xml:space="preserve">Employer - </w:t>
       </w:r>
       <w:r>
@@ -5598,6 +5343,7 @@
           <w:szCs w:val="22"/>
           <w:lang w:val="en-AU" w:eastAsia="en-US"/>
         </w:rPr>
+        <w:lastRenderedPageBreak/>
         <w:t xml:space="preserve">Employer – </w:t>
       </w:r>
       <w:r>
@@ -5990,29 +5736,7 @@
           <w:szCs w:val="22"/>
           <w:lang w:val="en-GB" w:eastAsia="en-GB"/>
         </w:rPr>
-        <w:t>Delivered end-to-end processes which minimised the revenue loss by identifying subscriber behaviour using geo-</w:t>
-      </w:r>
-      <w:proofErr w:type="spellStart"/>
-      <w:r>
-        <w:rPr>
-          <w:rFonts w:ascii="Verdana" w:eastAsia="Times New Roman" w:hAnsi="Verdana" w:cs="Arial"/>
-          <w:color w:val="auto"/>
-          <w:sz w:val="22"/>
-          <w:szCs w:val="22"/>
-          <w:lang w:val="en-GB" w:eastAsia="en-GB"/>
-        </w:rPr>
-        <w:t>spacial</w:t>
-      </w:r>
-      <w:proofErr w:type="spellEnd"/>
-      <w:r>
-        <w:rPr>
-          <w:rFonts w:ascii="Verdana" w:eastAsia="Times New Roman" w:hAnsi="Verdana" w:cs="Arial"/>
-          <w:color w:val="auto"/>
-          <w:sz w:val="22"/>
-          <w:szCs w:val="22"/>
-          <w:lang w:val="en-GB" w:eastAsia="en-GB"/>
-        </w:rPr>
-        <w:t xml:space="preserve"> analytics in R.</w:t>
+        <w:t>Delivered end-to-end processes which minimised the revenue loss by identifying subscriber behaviour using geo-spacial analytics in R.</w:t>
       </w:r>
     </w:p>
     <w:p>
@@ -6947,6 +6671,119 @@
     </w:lvl>
   </w:abstractNum>
   <w:abstractNum w:abstractNumId="3" w15:restartNumberingAfterBreak="0">
+    <w:nsid w:val="0F991434"/>
+    <w:multiLevelType w:val="hybridMultilevel"/>
+    <w:tmpl w:val="745C6664"/>
+    <w:lvl w:ilvl="0" w:tplc="0C090001">
+      <w:start w:val="1"/>
+      <w:numFmt w:val="bullet"/>
+      <w:lvlText w:val=""/>
+      <w:lvlJc w:val="left"/>
+      <w:pPr>
+        <w:ind w:left="1440" w:hanging="360"/>
+      </w:pPr>
+      <w:rPr>
+        <w:rFonts w:ascii="Symbol" w:hAnsi="Symbol" w:hint="default"/>
+      </w:rPr>
+    </w:lvl>
+    <w:lvl w:ilvl="1" w:tplc="0C090003" w:tentative="1">
+      <w:start w:val="1"/>
+      <w:numFmt w:val="bullet"/>
+      <w:lvlText w:val="o"/>
+      <w:lvlJc w:val="left"/>
+      <w:pPr>
+        <w:ind w:left="2160" w:hanging="360"/>
+      </w:pPr>
+      <w:rPr>
+        <w:rFonts w:ascii="Courier New" w:hAnsi="Courier New" w:cs="Courier New" w:hint="default"/>
+      </w:rPr>
+    </w:lvl>
+    <w:lvl w:ilvl="2" w:tplc="0C090005" w:tentative="1">
+      <w:start w:val="1"/>
+      <w:numFmt w:val="bullet"/>
+      <w:lvlText w:val=""/>
+      <w:lvlJc w:val="left"/>
+      <w:pPr>
+        <w:ind w:left="2880" w:hanging="360"/>
+      </w:pPr>
+      <w:rPr>
+        <w:rFonts w:ascii="Wingdings" w:hAnsi="Wingdings" w:hint="default"/>
+      </w:rPr>
+    </w:lvl>
+    <w:lvl w:ilvl="3" w:tplc="0C090001" w:tentative="1">
+      <w:start w:val="1"/>
+      <w:numFmt w:val="bullet"/>
+      <w:lvlText w:val=""/>
+      <w:lvlJc w:val="left"/>
+      <w:pPr>
+        <w:ind w:left="3600" w:hanging="360"/>
+      </w:pPr>
+      <w:rPr>
+        <w:rFonts w:ascii="Symbol" w:hAnsi="Symbol" w:hint="default"/>
+      </w:rPr>
+    </w:lvl>
+    <w:lvl w:ilvl="4" w:tplc="0C090003" w:tentative="1">
+      <w:start w:val="1"/>
+      <w:numFmt w:val="bullet"/>
+      <w:lvlText w:val="o"/>
+      <w:lvlJc w:val="left"/>
+      <w:pPr>
+        <w:ind w:left="4320" w:hanging="360"/>
+      </w:pPr>
+      <w:rPr>
+        <w:rFonts w:ascii="Courier New" w:hAnsi="Courier New" w:cs="Courier New" w:hint="default"/>
+      </w:rPr>
+    </w:lvl>
+    <w:lvl w:ilvl="5" w:tplc="0C090005" w:tentative="1">
+      <w:start w:val="1"/>
+      <w:numFmt w:val="bullet"/>
+      <w:lvlText w:val=""/>
+      <w:lvlJc w:val="left"/>
+      <w:pPr>
+        <w:ind w:left="5040" w:hanging="360"/>
+      </w:pPr>
+      <w:rPr>
+        <w:rFonts w:ascii="Wingdings" w:hAnsi="Wingdings" w:hint="default"/>
+      </w:rPr>
+    </w:lvl>
+    <w:lvl w:ilvl="6" w:tplc="0C090001" w:tentative="1">
+      <w:start w:val="1"/>
+      <w:numFmt w:val="bullet"/>
+      <w:lvlText w:val=""/>
+      <w:lvlJc w:val="left"/>
+      <w:pPr>
+        <w:ind w:left="5760" w:hanging="360"/>
+      </w:pPr>
+      <w:rPr>
+        <w:rFonts w:ascii="Symbol" w:hAnsi="Symbol" w:hint="default"/>
+      </w:rPr>
+    </w:lvl>
+    <w:lvl w:ilvl="7" w:tplc="0C090003" w:tentative="1">
+      <w:start w:val="1"/>
+      <w:numFmt w:val="bullet"/>
+      <w:lvlText w:val="o"/>
+      <w:lvlJc w:val="left"/>
+      <w:pPr>
+        <w:ind w:left="6480" w:hanging="360"/>
+      </w:pPr>
+      <w:rPr>
+        <w:rFonts w:ascii="Courier New" w:hAnsi="Courier New" w:cs="Courier New" w:hint="default"/>
+      </w:rPr>
+    </w:lvl>
+    <w:lvl w:ilvl="8" w:tplc="0C090005" w:tentative="1">
+      <w:start w:val="1"/>
+      <w:numFmt w:val="bullet"/>
+      <w:lvlText w:val=""/>
+      <w:lvlJc w:val="left"/>
+      <w:pPr>
+        <w:ind w:left="7200" w:hanging="360"/>
+      </w:pPr>
+      <w:rPr>
+        <w:rFonts w:ascii="Wingdings" w:hAnsi="Wingdings" w:hint="default"/>
+      </w:rPr>
+    </w:lvl>
+  </w:abstractNum>
+  <w:abstractNum w:abstractNumId="4" w15:restartNumberingAfterBreak="0">
     <w:nsid w:val="0FA71F4E"/>
     <w:multiLevelType w:val="multilevel"/>
     <w:tmpl w:val="75105108"/>
@@ -7095,7 +6932,7 @@
       </w:rPr>
     </w:lvl>
   </w:abstractNum>
-  <w:abstractNum w:abstractNumId="4" w15:restartNumberingAfterBreak="0">
+  <w:abstractNum w:abstractNumId="5" w15:restartNumberingAfterBreak="0">
     <w:nsid w:val="13514DA5"/>
     <w:multiLevelType w:val="hybridMultilevel"/>
     <w:tmpl w:val="D7DA5AC0"/>
@@ -7208,7 +7045,7 @@
       </w:rPr>
     </w:lvl>
   </w:abstractNum>
-  <w:abstractNum w:abstractNumId="5" w15:restartNumberingAfterBreak="0">
+  <w:abstractNum w:abstractNumId="6" w15:restartNumberingAfterBreak="0">
     <w:nsid w:val="19DD6036"/>
     <w:multiLevelType w:val="multilevel"/>
     <w:tmpl w:val="607E319A"/>
@@ -7357,7 +7194,119 @@
       </w:rPr>
     </w:lvl>
   </w:abstractNum>
-  <w:abstractNum w:abstractNumId="6" w15:restartNumberingAfterBreak="0">
+  <w:abstractNum w:abstractNumId="7" w15:restartNumberingAfterBreak="0">
+    <w:nsid w:val="1BD43791"/>
+    <w:multiLevelType w:val="hybridMultilevel"/>
+    <w:tmpl w:val="0B88BA34"/>
+    <w:lvl w:ilvl="0" w:tplc="DEA4F978">
+      <w:numFmt w:val="bullet"/>
+      <w:lvlText w:val="•"/>
+      <w:lvlJc w:val="left"/>
+      <w:pPr>
+        <w:ind w:left="1440" w:hanging="720"/>
+      </w:pPr>
+      <w:rPr>
+        <w:rFonts w:ascii="Verdana" w:eastAsia="Times New Roman" w:hAnsi="Verdana" w:cs="Arial" w:hint="default"/>
+      </w:rPr>
+    </w:lvl>
+    <w:lvl w:ilvl="1" w:tplc="0C090003" w:tentative="1">
+      <w:start w:val="1"/>
+      <w:numFmt w:val="bullet"/>
+      <w:lvlText w:val="o"/>
+      <w:lvlJc w:val="left"/>
+      <w:pPr>
+        <w:ind w:left="1800" w:hanging="360"/>
+      </w:pPr>
+      <w:rPr>
+        <w:rFonts w:ascii="Courier New" w:hAnsi="Courier New" w:cs="Courier New" w:hint="default"/>
+      </w:rPr>
+    </w:lvl>
+    <w:lvl w:ilvl="2" w:tplc="0C090005" w:tentative="1">
+      <w:start w:val="1"/>
+      <w:numFmt w:val="bullet"/>
+      <w:lvlText w:val=""/>
+      <w:lvlJc w:val="left"/>
+      <w:pPr>
+        <w:ind w:left="2520" w:hanging="360"/>
+      </w:pPr>
+      <w:rPr>
+        <w:rFonts w:ascii="Wingdings" w:hAnsi="Wingdings" w:hint="default"/>
+      </w:rPr>
+    </w:lvl>
+    <w:lvl w:ilvl="3" w:tplc="0C090001" w:tentative="1">
+      <w:start w:val="1"/>
+      <w:numFmt w:val="bullet"/>
+      <w:lvlText w:val=""/>
+      <w:lvlJc w:val="left"/>
+      <w:pPr>
+        <w:ind w:left="3240" w:hanging="360"/>
+      </w:pPr>
+      <w:rPr>
+        <w:rFonts w:ascii="Symbol" w:hAnsi="Symbol" w:hint="default"/>
+      </w:rPr>
+    </w:lvl>
+    <w:lvl w:ilvl="4" w:tplc="0C090003" w:tentative="1">
+      <w:start w:val="1"/>
+      <w:numFmt w:val="bullet"/>
+      <w:lvlText w:val="o"/>
+      <w:lvlJc w:val="left"/>
+      <w:pPr>
+        <w:ind w:left="3960" w:hanging="360"/>
+      </w:pPr>
+      <w:rPr>
+        <w:rFonts w:ascii="Courier New" w:hAnsi="Courier New" w:cs="Courier New" w:hint="default"/>
+      </w:rPr>
+    </w:lvl>
+    <w:lvl w:ilvl="5" w:tplc="0C090005" w:tentative="1">
+      <w:start w:val="1"/>
+      <w:numFmt w:val="bullet"/>
+      <w:lvlText w:val=""/>
+      <w:lvlJc w:val="left"/>
+      <w:pPr>
+        <w:ind w:left="4680" w:hanging="360"/>
+      </w:pPr>
+      <w:rPr>
+        <w:rFonts w:ascii="Wingdings" w:hAnsi="Wingdings" w:hint="default"/>
+      </w:rPr>
+    </w:lvl>
+    <w:lvl w:ilvl="6" w:tplc="0C090001" w:tentative="1">
+      <w:start w:val="1"/>
+      <w:numFmt w:val="bullet"/>
+      <w:lvlText w:val=""/>
+      <w:lvlJc w:val="left"/>
+      <w:pPr>
+        <w:ind w:left="5400" w:hanging="360"/>
+      </w:pPr>
+      <w:rPr>
+        <w:rFonts w:ascii="Symbol" w:hAnsi="Symbol" w:hint="default"/>
+      </w:rPr>
+    </w:lvl>
+    <w:lvl w:ilvl="7" w:tplc="0C090003" w:tentative="1">
+      <w:start w:val="1"/>
+      <w:numFmt w:val="bullet"/>
+      <w:lvlText w:val="o"/>
+      <w:lvlJc w:val="left"/>
+      <w:pPr>
+        <w:ind w:left="6120" w:hanging="360"/>
+      </w:pPr>
+      <w:rPr>
+        <w:rFonts w:ascii="Courier New" w:hAnsi="Courier New" w:cs="Courier New" w:hint="default"/>
+      </w:rPr>
+    </w:lvl>
+    <w:lvl w:ilvl="8" w:tplc="0C090005" w:tentative="1">
+      <w:start w:val="1"/>
+      <w:numFmt w:val="bullet"/>
+      <w:lvlText w:val=""/>
+      <w:lvlJc w:val="left"/>
+      <w:pPr>
+        <w:ind w:left="6840" w:hanging="360"/>
+      </w:pPr>
+      <w:rPr>
+        <w:rFonts w:ascii="Wingdings" w:hAnsi="Wingdings" w:hint="default"/>
+      </w:rPr>
+    </w:lvl>
+  </w:abstractNum>
+  <w:abstractNum w:abstractNumId="8" w15:restartNumberingAfterBreak="0">
     <w:nsid w:val="1E5142A8"/>
     <w:multiLevelType w:val="hybridMultilevel"/>
     <w:tmpl w:val="D83E5346"/>
@@ -7470,7 +7419,120 @@
       </w:rPr>
     </w:lvl>
   </w:abstractNum>
-  <w:abstractNum w:abstractNumId="7" w15:restartNumberingAfterBreak="0">
+  <w:abstractNum w:abstractNumId="9" w15:restartNumberingAfterBreak="0">
+    <w:nsid w:val="1EB11EAC"/>
+    <w:multiLevelType w:val="hybridMultilevel"/>
+    <w:tmpl w:val="E2BA88F4"/>
+    <w:lvl w:ilvl="0" w:tplc="0C090001">
+      <w:start w:val="1"/>
+      <w:numFmt w:val="bullet"/>
+      <w:lvlText w:val=""/>
+      <w:lvlJc w:val="left"/>
+      <w:pPr>
+        <w:ind w:left="1080" w:hanging="360"/>
+      </w:pPr>
+      <w:rPr>
+        <w:rFonts w:ascii="Symbol" w:hAnsi="Symbol" w:hint="default"/>
+      </w:rPr>
+    </w:lvl>
+    <w:lvl w:ilvl="1" w:tplc="0C090003" w:tentative="1">
+      <w:start w:val="1"/>
+      <w:numFmt w:val="bullet"/>
+      <w:lvlText w:val="o"/>
+      <w:lvlJc w:val="left"/>
+      <w:pPr>
+        <w:ind w:left="1800" w:hanging="360"/>
+      </w:pPr>
+      <w:rPr>
+        <w:rFonts w:ascii="Courier New" w:hAnsi="Courier New" w:cs="Courier New" w:hint="default"/>
+      </w:rPr>
+    </w:lvl>
+    <w:lvl w:ilvl="2" w:tplc="0C090005" w:tentative="1">
+      <w:start w:val="1"/>
+      <w:numFmt w:val="bullet"/>
+      <w:lvlText w:val=""/>
+      <w:lvlJc w:val="left"/>
+      <w:pPr>
+        <w:ind w:left="2520" w:hanging="360"/>
+      </w:pPr>
+      <w:rPr>
+        <w:rFonts w:ascii="Wingdings" w:hAnsi="Wingdings" w:hint="default"/>
+      </w:rPr>
+    </w:lvl>
+    <w:lvl w:ilvl="3" w:tplc="0C090001" w:tentative="1">
+      <w:start w:val="1"/>
+      <w:numFmt w:val="bullet"/>
+      <w:lvlText w:val=""/>
+      <w:lvlJc w:val="left"/>
+      <w:pPr>
+        <w:ind w:left="3240" w:hanging="360"/>
+      </w:pPr>
+      <w:rPr>
+        <w:rFonts w:ascii="Symbol" w:hAnsi="Symbol" w:hint="default"/>
+      </w:rPr>
+    </w:lvl>
+    <w:lvl w:ilvl="4" w:tplc="0C090003" w:tentative="1">
+      <w:start w:val="1"/>
+      <w:numFmt w:val="bullet"/>
+      <w:lvlText w:val="o"/>
+      <w:lvlJc w:val="left"/>
+      <w:pPr>
+        <w:ind w:left="3960" w:hanging="360"/>
+      </w:pPr>
+      <w:rPr>
+        <w:rFonts w:ascii="Courier New" w:hAnsi="Courier New" w:cs="Courier New" w:hint="default"/>
+      </w:rPr>
+    </w:lvl>
+    <w:lvl w:ilvl="5" w:tplc="0C090005" w:tentative="1">
+      <w:start w:val="1"/>
+      <w:numFmt w:val="bullet"/>
+      <w:lvlText w:val=""/>
+      <w:lvlJc w:val="left"/>
+      <w:pPr>
+        <w:ind w:left="4680" w:hanging="360"/>
+      </w:pPr>
+      <w:rPr>
+        <w:rFonts w:ascii="Wingdings" w:hAnsi="Wingdings" w:hint="default"/>
+      </w:rPr>
+    </w:lvl>
+    <w:lvl w:ilvl="6" w:tplc="0C090001" w:tentative="1">
+      <w:start w:val="1"/>
+      <w:numFmt w:val="bullet"/>
+      <w:lvlText w:val=""/>
+      <w:lvlJc w:val="left"/>
+      <w:pPr>
+        <w:ind w:left="5400" w:hanging="360"/>
+      </w:pPr>
+      <w:rPr>
+        <w:rFonts w:ascii="Symbol" w:hAnsi="Symbol" w:hint="default"/>
+      </w:rPr>
+    </w:lvl>
+    <w:lvl w:ilvl="7" w:tplc="0C090003" w:tentative="1">
+      <w:start w:val="1"/>
+      <w:numFmt w:val="bullet"/>
+      <w:lvlText w:val="o"/>
+      <w:lvlJc w:val="left"/>
+      <w:pPr>
+        <w:ind w:left="6120" w:hanging="360"/>
+      </w:pPr>
+      <w:rPr>
+        <w:rFonts w:ascii="Courier New" w:hAnsi="Courier New" w:cs="Courier New" w:hint="default"/>
+      </w:rPr>
+    </w:lvl>
+    <w:lvl w:ilvl="8" w:tplc="0C090005" w:tentative="1">
+      <w:start w:val="1"/>
+      <w:numFmt w:val="bullet"/>
+      <w:lvlText w:val=""/>
+      <w:lvlJc w:val="left"/>
+      <w:pPr>
+        <w:ind w:left="6840" w:hanging="360"/>
+      </w:pPr>
+      <w:rPr>
+        <w:rFonts w:ascii="Wingdings" w:hAnsi="Wingdings" w:hint="default"/>
+      </w:rPr>
+    </w:lvl>
+  </w:abstractNum>
+  <w:abstractNum w:abstractNumId="10" w15:restartNumberingAfterBreak="0">
     <w:nsid w:val="21671E65"/>
     <w:multiLevelType w:val="multilevel"/>
     <w:tmpl w:val="5A7C9F32"/>
@@ -7619,7 +7681,7 @@
       </w:rPr>
     </w:lvl>
   </w:abstractNum>
-  <w:abstractNum w:abstractNumId="8" w15:restartNumberingAfterBreak="0">
+  <w:abstractNum w:abstractNumId="11" w15:restartNumberingAfterBreak="0">
     <w:nsid w:val="23221AEF"/>
     <w:multiLevelType w:val="hybridMultilevel"/>
     <w:tmpl w:val="608A2C46"/>
@@ -7732,7 +7794,7 @@
       </w:rPr>
     </w:lvl>
   </w:abstractNum>
-  <w:abstractNum w:abstractNumId="9" w15:restartNumberingAfterBreak="0">
+  <w:abstractNum w:abstractNumId="12" w15:restartNumberingAfterBreak="0">
     <w:nsid w:val="284B097C"/>
     <w:multiLevelType w:val="hybridMultilevel"/>
     <w:tmpl w:val="15C69548"/>
@@ -7845,7 +7907,7 @@
       </w:rPr>
     </w:lvl>
   </w:abstractNum>
-  <w:abstractNum w:abstractNumId="10" w15:restartNumberingAfterBreak="0">
+  <w:abstractNum w:abstractNumId="13" w15:restartNumberingAfterBreak="0">
     <w:nsid w:val="299A2471"/>
     <w:multiLevelType w:val="multilevel"/>
     <w:tmpl w:val="530445E8"/>
@@ -7994,7 +8056,7 @@
       </w:rPr>
     </w:lvl>
   </w:abstractNum>
-  <w:abstractNum w:abstractNumId="11" w15:restartNumberingAfterBreak="0">
+  <w:abstractNum w:abstractNumId="14" w15:restartNumberingAfterBreak="0">
     <w:nsid w:val="29D74D52"/>
     <w:multiLevelType w:val="hybridMultilevel"/>
     <w:tmpl w:val="15B879D8"/>
@@ -8107,7 +8169,7 @@
       </w:rPr>
     </w:lvl>
   </w:abstractNum>
-  <w:abstractNum w:abstractNumId="12" w15:restartNumberingAfterBreak="0">
+  <w:abstractNum w:abstractNumId="15" w15:restartNumberingAfterBreak="0">
     <w:nsid w:val="2B8971A5"/>
     <w:multiLevelType w:val="multilevel"/>
     <w:tmpl w:val="1FD8F8FE"/>
@@ -8256,7 +8318,7 @@
       </w:rPr>
     </w:lvl>
   </w:abstractNum>
-  <w:abstractNum w:abstractNumId="13" w15:restartNumberingAfterBreak="0">
+  <w:abstractNum w:abstractNumId="16" w15:restartNumberingAfterBreak="0">
     <w:nsid w:val="309A426F"/>
     <w:multiLevelType w:val="hybridMultilevel"/>
     <w:tmpl w:val="C16A7A8E"/>
@@ -8369,7 +8431,7 @@
       </w:rPr>
     </w:lvl>
   </w:abstractNum>
-  <w:abstractNum w:abstractNumId="14" w15:restartNumberingAfterBreak="0">
+  <w:abstractNum w:abstractNumId="17" w15:restartNumberingAfterBreak="0">
     <w:nsid w:val="30E203C6"/>
     <w:multiLevelType w:val="hybridMultilevel"/>
     <w:tmpl w:val="DBC22D12"/>
@@ -8482,7 +8544,7 @@
       </w:rPr>
     </w:lvl>
   </w:abstractNum>
-  <w:abstractNum w:abstractNumId="15" w15:restartNumberingAfterBreak="0">
+  <w:abstractNum w:abstractNumId="18" w15:restartNumberingAfterBreak="0">
     <w:nsid w:val="31C6338F"/>
     <w:multiLevelType w:val="hybridMultilevel"/>
     <w:tmpl w:val="8E5006A8"/>
@@ -8595,7 +8657,7 @@
       </w:rPr>
     </w:lvl>
   </w:abstractNum>
-  <w:abstractNum w:abstractNumId="16" w15:restartNumberingAfterBreak="0">
+  <w:abstractNum w:abstractNumId="19" w15:restartNumberingAfterBreak="0">
     <w:nsid w:val="37004236"/>
     <w:multiLevelType w:val="hybridMultilevel"/>
     <w:tmpl w:val="97B483EA"/>
@@ -8707,7 +8769,7 @@
       </w:rPr>
     </w:lvl>
   </w:abstractNum>
-  <w:abstractNum w:abstractNumId="17" w15:restartNumberingAfterBreak="0">
+  <w:abstractNum w:abstractNumId="20" w15:restartNumberingAfterBreak="0">
     <w:nsid w:val="37BA2313"/>
     <w:multiLevelType w:val="hybridMultilevel"/>
     <w:tmpl w:val="8AAC7474"/>
@@ -8820,7 +8882,7 @@
       </w:rPr>
     </w:lvl>
   </w:abstractNum>
-  <w:abstractNum w:abstractNumId="18" w15:restartNumberingAfterBreak="0">
+  <w:abstractNum w:abstractNumId="21" w15:restartNumberingAfterBreak="0">
     <w:nsid w:val="3CBC46B5"/>
     <w:multiLevelType w:val="hybridMultilevel"/>
     <w:tmpl w:val="C046DC02"/>
@@ -8933,7 +8995,7 @@
       </w:rPr>
     </w:lvl>
   </w:abstractNum>
-  <w:abstractNum w:abstractNumId="19" w15:restartNumberingAfterBreak="0">
+  <w:abstractNum w:abstractNumId="22" w15:restartNumberingAfterBreak="0">
     <w:nsid w:val="407B5DA8"/>
     <w:multiLevelType w:val="hybridMultilevel"/>
     <w:tmpl w:val="FD485F04"/>
@@ -9046,7 +9108,119 @@
       </w:rPr>
     </w:lvl>
   </w:abstractNum>
-  <w:abstractNum w:abstractNumId="20" w15:restartNumberingAfterBreak="0">
+  <w:abstractNum w:abstractNumId="23" w15:restartNumberingAfterBreak="0">
+    <w:nsid w:val="43D62CA2"/>
+    <w:multiLevelType w:val="hybridMultilevel"/>
+    <w:tmpl w:val="F2C03052"/>
+    <w:lvl w:ilvl="0" w:tplc="DEA4F978">
+      <w:numFmt w:val="bullet"/>
+      <w:lvlText w:val="•"/>
+      <w:lvlJc w:val="left"/>
+      <w:pPr>
+        <w:ind w:left="1440" w:hanging="720"/>
+      </w:pPr>
+      <w:rPr>
+        <w:rFonts w:ascii="Verdana" w:eastAsia="Times New Roman" w:hAnsi="Verdana" w:cs="Arial" w:hint="default"/>
+      </w:rPr>
+    </w:lvl>
+    <w:lvl w:ilvl="1" w:tplc="0C090003" w:tentative="1">
+      <w:start w:val="1"/>
+      <w:numFmt w:val="bullet"/>
+      <w:lvlText w:val="o"/>
+      <w:lvlJc w:val="left"/>
+      <w:pPr>
+        <w:ind w:left="1440" w:hanging="360"/>
+      </w:pPr>
+      <w:rPr>
+        <w:rFonts w:ascii="Courier New" w:hAnsi="Courier New" w:cs="Courier New" w:hint="default"/>
+      </w:rPr>
+    </w:lvl>
+    <w:lvl w:ilvl="2" w:tplc="0C090005" w:tentative="1">
+      <w:start w:val="1"/>
+      <w:numFmt w:val="bullet"/>
+      <w:lvlText w:val=""/>
+      <w:lvlJc w:val="left"/>
+      <w:pPr>
+        <w:ind w:left="2160" w:hanging="360"/>
+      </w:pPr>
+      <w:rPr>
+        <w:rFonts w:ascii="Wingdings" w:hAnsi="Wingdings" w:hint="default"/>
+      </w:rPr>
+    </w:lvl>
+    <w:lvl w:ilvl="3" w:tplc="0C090001" w:tentative="1">
+      <w:start w:val="1"/>
+      <w:numFmt w:val="bullet"/>
+      <w:lvlText w:val=""/>
+      <w:lvlJc w:val="left"/>
+      <w:pPr>
+        <w:ind w:left="2880" w:hanging="360"/>
+      </w:pPr>
+      <w:rPr>
+        <w:rFonts w:ascii="Symbol" w:hAnsi="Symbol" w:hint="default"/>
+      </w:rPr>
+    </w:lvl>
+    <w:lvl w:ilvl="4" w:tplc="0C090003" w:tentative="1">
+      <w:start w:val="1"/>
+      <w:numFmt w:val="bullet"/>
+      <w:lvlText w:val="o"/>
+      <w:lvlJc w:val="left"/>
+      <w:pPr>
+        <w:ind w:left="3600" w:hanging="360"/>
+      </w:pPr>
+      <w:rPr>
+        <w:rFonts w:ascii="Courier New" w:hAnsi="Courier New" w:cs="Courier New" w:hint="default"/>
+      </w:rPr>
+    </w:lvl>
+    <w:lvl w:ilvl="5" w:tplc="0C090005" w:tentative="1">
+      <w:start w:val="1"/>
+      <w:numFmt w:val="bullet"/>
+      <w:lvlText w:val=""/>
+      <w:lvlJc w:val="left"/>
+      <w:pPr>
+        <w:ind w:left="4320" w:hanging="360"/>
+      </w:pPr>
+      <w:rPr>
+        <w:rFonts w:ascii="Wingdings" w:hAnsi="Wingdings" w:hint="default"/>
+      </w:rPr>
+    </w:lvl>
+    <w:lvl w:ilvl="6" w:tplc="0C090001" w:tentative="1">
+      <w:start w:val="1"/>
+      <w:numFmt w:val="bullet"/>
+      <w:lvlText w:val=""/>
+      <w:lvlJc w:val="left"/>
+      <w:pPr>
+        <w:ind w:left="5040" w:hanging="360"/>
+      </w:pPr>
+      <w:rPr>
+        <w:rFonts w:ascii="Symbol" w:hAnsi="Symbol" w:hint="default"/>
+      </w:rPr>
+    </w:lvl>
+    <w:lvl w:ilvl="7" w:tplc="0C090003" w:tentative="1">
+      <w:start w:val="1"/>
+      <w:numFmt w:val="bullet"/>
+      <w:lvlText w:val="o"/>
+      <w:lvlJc w:val="left"/>
+      <w:pPr>
+        <w:ind w:left="5760" w:hanging="360"/>
+      </w:pPr>
+      <w:rPr>
+        <w:rFonts w:ascii="Courier New" w:hAnsi="Courier New" w:cs="Courier New" w:hint="default"/>
+      </w:rPr>
+    </w:lvl>
+    <w:lvl w:ilvl="8" w:tplc="0C090005" w:tentative="1">
+      <w:start w:val="1"/>
+      <w:numFmt w:val="bullet"/>
+      <w:lvlText w:val=""/>
+      <w:lvlJc w:val="left"/>
+      <w:pPr>
+        <w:ind w:left="6480" w:hanging="360"/>
+      </w:pPr>
+      <w:rPr>
+        <w:rFonts w:ascii="Wingdings" w:hAnsi="Wingdings" w:hint="default"/>
+      </w:rPr>
+    </w:lvl>
+  </w:abstractNum>
+  <w:abstractNum w:abstractNumId="24" w15:restartNumberingAfterBreak="0">
     <w:nsid w:val="475B402B"/>
     <w:multiLevelType w:val="multilevel"/>
     <w:tmpl w:val="CCEAB38E"/>
@@ -9195,7 +9369,7 @@
       </w:rPr>
     </w:lvl>
   </w:abstractNum>
-  <w:abstractNum w:abstractNumId="21" w15:restartNumberingAfterBreak="0">
+  <w:abstractNum w:abstractNumId="25" w15:restartNumberingAfterBreak="0">
     <w:nsid w:val="49811127"/>
     <w:multiLevelType w:val="multilevel"/>
     <w:tmpl w:val="671891E4"/>
@@ -9344,7 +9518,7 @@
       </w:rPr>
     </w:lvl>
   </w:abstractNum>
-  <w:abstractNum w:abstractNumId="22" w15:restartNumberingAfterBreak="0">
+  <w:abstractNum w:abstractNumId="26" w15:restartNumberingAfterBreak="0">
     <w:nsid w:val="49881917"/>
     <w:multiLevelType w:val="multilevel"/>
     <w:tmpl w:val="951A825A"/>
@@ -9493,7 +9667,7 @@
       </w:rPr>
     </w:lvl>
   </w:abstractNum>
-  <w:abstractNum w:abstractNumId="23" w15:restartNumberingAfterBreak="0">
+  <w:abstractNum w:abstractNumId="27" w15:restartNumberingAfterBreak="0">
     <w:nsid w:val="4DE04418"/>
     <w:multiLevelType w:val="multilevel"/>
     <w:tmpl w:val="2ACE9BA2"/>
@@ -9642,7 +9816,7 @@
       </w:rPr>
     </w:lvl>
   </w:abstractNum>
-  <w:abstractNum w:abstractNumId="24" w15:restartNumberingAfterBreak="0">
+  <w:abstractNum w:abstractNumId="28" w15:restartNumberingAfterBreak="0">
     <w:nsid w:val="4F4A1841"/>
     <w:multiLevelType w:val="hybridMultilevel"/>
     <w:tmpl w:val="7A1AA644"/>
@@ -9755,7 +9929,7 @@
       </w:rPr>
     </w:lvl>
   </w:abstractNum>
-  <w:abstractNum w:abstractNumId="25" w15:restartNumberingAfterBreak="0">
+  <w:abstractNum w:abstractNumId="29" w15:restartNumberingAfterBreak="0">
     <w:nsid w:val="51EA4AED"/>
     <w:multiLevelType w:val="hybridMultilevel"/>
     <w:tmpl w:val="C21AD59A"/>
@@ -9867,7 +10041,7 @@
       </w:rPr>
     </w:lvl>
   </w:abstractNum>
-  <w:abstractNum w:abstractNumId="26" w15:restartNumberingAfterBreak="0">
+  <w:abstractNum w:abstractNumId="30" w15:restartNumberingAfterBreak="0">
     <w:nsid w:val="585E69AE"/>
     <w:multiLevelType w:val="hybridMultilevel"/>
     <w:tmpl w:val="FA40FD4C"/>
@@ -9980,7 +10154,7 @@
       </w:rPr>
     </w:lvl>
   </w:abstractNum>
-  <w:abstractNum w:abstractNumId="27" w15:restartNumberingAfterBreak="0">
+  <w:abstractNum w:abstractNumId="31" w15:restartNumberingAfterBreak="0">
     <w:nsid w:val="594E41DD"/>
     <w:multiLevelType w:val="hybridMultilevel"/>
     <w:tmpl w:val="18AE2040"/>
@@ -10093,7 +10267,7 @@
       </w:rPr>
     </w:lvl>
   </w:abstractNum>
-  <w:abstractNum w:abstractNumId="28" w15:restartNumberingAfterBreak="0">
+  <w:abstractNum w:abstractNumId="32" w15:restartNumberingAfterBreak="0">
     <w:nsid w:val="599502FD"/>
     <w:multiLevelType w:val="hybridMultilevel"/>
     <w:tmpl w:val="97F414B4"/>
@@ -10233,7 +10407,119 @@
       </w:rPr>
     </w:lvl>
   </w:abstractNum>
-  <w:abstractNum w:abstractNumId="29" w15:restartNumberingAfterBreak="0">
+  <w:abstractNum w:abstractNumId="33" w15:restartNumberingAfterBreak="0">
+    <w:nsid w:val="5B0339E4"/>
+    <w:multiLevelType w:val="hybridMultilevel"/>
+    <w:tmpl w:val="2072215E"/>
+    <w:lvl w:ilvl="0" w:tplc="DEA4F978">
+      <w:numFmt w:val="bullet"/>
+      <w:lvlText w:val="•"/>
+      <w:lvlJc w:val="left"/>
+      <w:pPr>
+        <w:ind w:left="2160" w:hanging="720"/>
+      </w:pPr>
+      <w:rPr>
+        <w:rFonts w:ascii="Verdana" w:eastAsia="Times New Roman" w:hAnsi="Verdana" w:cs="Arial" w:hint="default"/>
+      </w:rPr>
+    </w:lvl>
+    <w:lvl w:ilvl="1" w:tplc="0C090003" w:tentative="1">
+      <w:start w:val="1"/>
+      <w:numFmt w:val="bullet"/>
+      <w:lvlText w:val="o"/>
+      <w:lvlJc w:val="left"/>
+      <w:pPr>
+        <w:ind w:left="2160" w:hanging="360"/>
+      </w:pPr>
+      <w:rPr>
+        <w:rFonts w:ascii="Courier New" w:hAnsi="Courier New" w:cs="Courier New" w:hint="default"/>
+      </w:rPr>
+    </w:lvl>
+    <w:lvl w:ilvl="2" w:tplc="0C090005" w:tentative="1">
+      <w:start w:val="1"/>
+      <w:numFmt w:val="bullet"/>
+      <w:lvlText w:val=""/>
+      <w:lvlJc w:val="left"/>
+      <w:pPr>
+        <w:ind w:left="2880" w:hanging="360"/>
+      </w:pPr>
+      <w:rPr>
+        <w:rFonts w:ascii="Wingdings" w:hAnsi="Wingdings" w:hint="default"/>
+      </w:rPr>
+    </w:lvl>
+    <w:lvl w:ilvl="3" w:tplc="0C090001" w:tentative="1">
+      <w:start w:val="1"/>
+      <w:numFmt w:val="bullet"/>
+      <w:lvlText w:val=""/>
+      <w:lvlJc w:val="left"/>
+      <w:pPr>
+        <w:ind w:left="3600" w:hanging="360"/>
+      </w:pPr>
+      <w:rPr>
+        <w:rFonts w:ascii="Symbol" w:hAnsi="Symbol" w:hint="default"/>
+      </w:rPr>
+    </w:lvl>
+    <w:lvl w:ilvl="4" w:tplc="0C090003" w:tentative="1">
+      <w:start w:val="1"/>
+      <w:numFmt w:val="bullet"/>
+      <w:lvlText w:val="o"/>
+      <w:lvlJc w:val="left"/>
+      <w:pPr>
+        <w:ind w:left="4320" w:hanging="360"/>
+      </w:pPr>
+      <w:rPr>
+        <w:rFonts w:ascii="Courier New" w:hAnsi="Courier New" w:cs="Courier New" w:hint="default"/>
+      </w:rPr>
+    </w:lvl>
+    <w:lvl w:ilvl="5" w:tplc="0C090005" w:tentative="1">
+      <w:start w:val="1"/>
+      <w:numFmt w:val="bullet"/>
+      <w:lvlText w:val=""/>
+      <w:lvlJc w:val="left"/>
+      <w:pPr>
+        <w:ind w:left="5040" w:hanging="360"/>
+      </w:pPr>
+      <w:rPr>
+        <w:rFonts w:ascii="Wingdings" w:hAnsi="Wingdings" w:hint="default"/>
+      </w:rPr>
+    </w:lvl>
+    <w:lvl w:ilvl="6" w:tplc="0C090001" w:tentative="1">
+      <w:start w:val="1"/>
+      <w:numFmt w:val="bullet"/>
+      <w:lvlText w:val=""/>
+      <w:lvlJc w:val="left"/>
+      <w:pPr>
+        <w:ind w:left="5760" w:hanging="360"/>
+      </w:pPr>
+      <w:rPr>
+        <w:rFonts w:ascii="Symbol" w:hAnsi="Symbol" w:hint="default"/>
+      </w:rPr>
+    </w:lvl>
+    <w:lvl w:ilvl="7" w:tplc="0C090003" w:tentative="1">
+      <w:start w:val="1"/>
+      <w:numFmt w:val="bullet"/>
+      <w:lvlText w:val="o"/>
+      <w:lvlJc w:val="left"/>
+      <w:pPr>
+        <w:ind w:left="6480" w:hanging="360"/>
+      </w:pPr>
+      <w:rPr>
+        <w:rFonts w:ascii="Courier New" w:hAnsi="Courier New" w:cs="Courier New" w:hint="default"/>
+      </w:rPr>
+    </w:lvl>
+    <w:lvl w:ilvl="8" w:tplc="0C090005" w:tentative="1">
+      <w:start w:val="1"/>
+      <w:numFmt w:val="bullet"/>
+      <w:lvlText w:val=""/>
+      <w:lvlJc w:val="left"/>
+      <w:pPr>
+        <w:ind w:left="7200" w:hanging="360"/>
+      </w:pPr>
+      <w:rPr>
+        <w:rFonts w:ascii="Wingdings" w:hAnsi="Wingdings" w:hint="default"/>
+      </w:rPr>
+    </w:lvl>
+  </w:abstractNum>
+  <w:abstractNum w:abstractNumId="34" w15:restartNumberingAfterBreak="0">
     <w:nsid w:val="5B7610C3"/>
     <w:multiLevelType w:val="hybridMultilevel"/>
     <w:tmpl w:val="6EB8F168"/>
@@ -10345,7 +10631,7 @@
       </w:rPr>
     </w:lvl>
   </w:abstractNum>
-  <w:abstractNum w:abstractNumId="30" w15:restartNumberingAfterBreak="0">
+  <w:abstractNum w:abstractNumId="35" w15:restartNumberingAfterBreak="0">
     <w:nsid w:val="5D9F6F76"/>
     <w:multiLevelType w:val="multilevel"/>
     <w:tmpl w:val="92565A66"/>
@@ -10494,7 +10780,7 @@
       </w:rPr>
     </w:lvl>
   </w:abstractNum>
-  <w:abstractNum w:abstractNumId="31" w15:restartNumberingAfterBreak="0">
+  <w:abstractNum w:abstractNumId="36" w15:restartNumberingAfterBreak="0">
     <w:nsid w:val="5E220DB5"/>
     <w:multiLevelType w:val="multilevel"/>
     <w:tmpl w:val="346ECA68"/>
@@ -10643,7 +10929,7 @@
       </w:rPr>
     </w:lvl>
   </w:abstractNum>
-  <w:abstractNum w:abstractNumId="32" w15:restartNumberingAfterBreak="0">
+  <w:abstractNum w:abstractNumId="37" w15:restartNumberingAfterBreak="0">
     <w:nsid w:val="639B03C4"/>
     <w:multiLevelType w:val="hybridMultilevel"/>
     <w:tmpl w:val="42B6C29C"/>
@@ -10755,7 +11041,7 @@
       </w:rPr>
     </w:lvl>
   </w:abstractNum>
-  <w:abstractNum w:abstractNumId="33" w15:restartNumberingAfterBreak="0">
+  <w:abstractNum w:abstractNumId="38" w15:restartNumberingAfterBreak="0">
     <w:nsid w:val="649213EF"/>
     <w:multiLevelType w:val="multilevel"/>
     <w:tmpl w:val="EE283298"/>
@@ -10904,7 +11190,120 @@
       </w:rPr>
     </w:lvl>
   </w:abstractNum>
-  <w:abstractNum w:abstractNumId="34" w15:restartNumberingAfterBreak="0">
+  <w:abstractNum w:abstractNumId="39" w15:restartNumberingAfterBreak="0">
+    <w:nsid w:val="65DF767A"/>
+    <w:multiLevelType w:val="hybridMultilevel"/>
+    <w:tmpl w:val="F028CBB2"/>
+    <w:lvl w:ilvl="0" w:tplc="0C090001">
+      <w:start w:val="1"/>
+      <w:numFmt w:val="bullet"/>
+      <w:lvlText w:val=""/>
+      <w:lvlJc w:val="left"/>
+      <w:pPr>
+        <w:ind w:left="720" w:hanging="360"/>
+      </w:pPr>
+      <w:rPr>
+        <w:rFonts w:ascii="Symbol" w:hAnsi="Symbol" w:hint="default"/>
+      </w:rPr>
+    </w:lvl>
+    <w:lvl w:ilvl="1" w:tplc="0C090003" w:tentative="1">
+      <w:start w:val="1"/>
+      <w:numFmt w:val="bullet"/>
+      <w:lvlText w:val="o"/>
+      <w:lvlJc w:val="left"/>
+      <w:pPr>
+        <w:ind w:left="1440" w:hanging="360"/>
+      </w:pPr>
+      <w:rPr>
+        <w:rFonts w:ascii="Courier New" w:hAnsi="Courier New" w:cs="Courier New" w:hint="default"/>
+      </w:rPr>
+    </w:lvl>
+    <w:lvl w:ilvl="2" w:tplc="0C090005" w:tentative="1">
+      <w:start w:val="1"/>
+      <w:numFmt w:val="bullet"/>
+      <w:lvlText w:val=""/>
+      <w:lvlJc w:val="left"/>
+      <w:pPr>
+        <w:ind w:left="2160" w:hanging="360"/>
+      </w:pPr>
+      <w:rPr>
+        <w:rFonts w:ascii="Wingdings" w:hAnsi="Wingdings" w:hint="default"/>
+      </w:rPr>
+    </w:lvl>
+    <w:lvl w:ilvl="3" w:tplc="0C090001" w:tentative="1">
+      <w:start w:val="1"/>
+      <w:numFmt w:val="bullet"/>
+      <w:lvlText w:val=""/>
+      <w:lvlJc w:val="left"/>
+      <w:pPr>
+        <w:ind w:left="2880" w:hanging="360"/>
+      </w:pPr>
+      <w:rPr>
+        <w:rFonts w:ascii="Symbol" w:hAnsi="Symbol" w:hint="default"/>
+      </w:rPr>
+    </w:lvl>
+    <w:lvl w:ilvl="4" w:tplc="0C090003" w:tentative="1">
+      <w:start w:val="1"/>
+      <w:numFmt w:val="bullet"/>
+      <w:lvlText w:val="o"/>
+      <w:lvlJc w:val="left"/>
+      <w:pPr>
+        <w:ind w:left="3600" w:hanging="360"/>
+      </w:pPr>
+      <w:rPr>
+        <w:rFonts w:ascii="Courier New" w:hAnsi="Courier New" w:cs="Courier New" w:hint="default"/>
+      </w:rPr>
+    </w:lvl>
+    <w:lvl w:ilvl="5" w:tplc="0C090005" w:tentative="1">
+      <w:start w:val="1"/>
+      <w:numFmt w:val="bullet"/>
+      <w:lvlText w:val=""/>
+      <w:lvlJc w:val="left"/>
+      <w:pPr>
+        <w:ind w:left="4320" w:hanging="360"/>
+      </w:pPr>
+      <w:rPr>
+        <w:rFonts w:ascii="Wingdings" w:hAnsi="Wingdings" w:hint="default"/>
+      </w:rPr>
+    </w:lvl>
+    <w:lvl w:ilvl="6" w:tplc="0C090001" w:tentative="1">
+      <w:start w:val="1"/>
+      <w:numFmt w:val="bullet"/>
+      <w:lvlText w:val=""/>
+      <w:lvlJc w:val="left"/>
+      <w:pPr>
+        <w:ind w:left="5040" w:hanging="360"/>
+      </w:pPr>
+      <w:rPr>
+        <w:rFonts w:ascii="Symbol" w:hAnsi="Symbol" w:hint="default"/>
+      </w:rPr>
+    </w:lvl>
+    <w:lvl w:ilvl="7" w:tplc="0C090003" w:tentative="1">
+      <w:start w:val="1"/>
+      <w:numFmt w:val="bullet"/>
+      <w:lvlText w:val="o"/>
+      <w:lvlJc w:val="left"/>
+      <w:pPr>
+        <w:ind w:left="5760" w:hanging="360"/>
+      </w:pPr>
+      <w:rPr>
+        <w:rFonts w:ascii="Courier New" w:hAnsi="Courier New" w:cs="Courier New" w:hint="default"/>
+      </w:rPr>
+    </w:lvl>
+    <w:lvl w:ilvl="8" w:tplc="0C090005" w:tentative="1">
+      <w:start w:val="1"/>
+      <w:numFmt w:val="bullet"/>
+      <w:lvlText w:val=""/>
+      <w:lvlJc w:val="left"/>
+      <w:pPr>
+        <w:ind w:left="6480" w:hanging="360"/>
+      </w:pPr>
+      <w:rPr>
+        <w:rFonts w:ascii="Wingdings" w:hAnsi="Wingdings" w:hint="default"/>
+      </w:rPr>
+    </w:lvl>
+  </w:abstractNum>
+  <w:abstractNum w:abstractNumId="40" w15:restartNumberingAfterBreak="0">
     <w:nsid w:val="682475D9"/>
     <w:multiLevelType w:val="hybridMultilevel"/>
     <w:tmpl w:val="AB1CC616"/>
@@ -11017,7 +11416,7 @@
       </w:rPr>
     </w:lvl>
   </w:abstractNum>
-  <w:abstractNum w:abstractNumId="35" w15:restartNumberingAfterBreak="0">
+  <w:abstractNum w:abstractNumId="41" w15:restartNumberingAfterBreak="0">
     <w:nsid w:val="6CCC2EC7"/>
     <w:multiLevelType w:val="hybridMultilevel"/>
     <w:tmpl w:val="683882B0"/>
@@ -11130,7 +11529,7 @@
       </w:rPr>
     </w:lvl>
   </w:abstractNum>
-  <w:abstractNum w:abstractNumId="36" w15:restartNumberingAfterBreak="0">
+  <w:abstractNum w:abstractNumId="42" w15:restartNumberingAfterBreak="0">
     <w:nsid w:val="6D1933CC"/>
     <w:multiLevelType w:val="hybridMultilevel"/>
     <w:tmpl w:val="BB86AC0E"/>
@@ -11243,7 +11642,7 @@
       </w:rPr>
     </w:lvl>
   </w:abstractNum>
-  <w:abstractNum w:abstractNumId="37" w15:restartNumberingAfterBreak="0">
+  <w:abstractNum w:abstractNumId="43" w15:restartNumberingAfterBreak="0">
     <w:nsid w:val="6E1E4908"/>
     <w:multiLevelType w:val="multilevel"/>
     <w:tmpl w:val="E39C8148"/>
@@ -11392,7 +11791,7 @@
       </w:rPr>
     </w:lvl>
   </w:abstractNum>
-  <w:abstractNum w:abstractNumId="38" w15:restartNumberingAfterBreak="0">
+  <w:abstractNum w:abstractNumId="44" w15:restartNumberingAfterBreak="0">
     <w:nsid w:val="6E312F91"/>
     <w:multiLevelType w:val="hybridMultilevel"/>
     <w:tmpl w:val="34342430"/>
@@ -11505,7 +11904,7 @@
       </w:rPr>
     </w:lvl>
   </w:abstractNum>
-  <w:abstractNum w:abstractNumId="39" w15:restartNumberingAfterBreak="0">
+  <w:abstractNum w:abstractNumId="45" w15:restartNumberingAfterBreak="0">
     <w:nsid w:val="6F4D3407"/>
     <w:multiLevelType w:val="multilevel"/>
     <w:tmpl w:val="57DAB758"/>
@@ -11654,7 +12053,7 @@
       </w:rPr>
     </w:lvl>
   </w:abstractNum>
-  <w:abstractNum w:abstractNumId="40" w15:restartNumberingAfterBreak="0">
+  <w:abstractNum w:abstractNumId="46" w15:restartNumberingAfterBreak="0">
     <w:nsid w:val="713C569D"/>
     <w:multiLevelType w:val="hybridMultilevel"/>
     <w:tmpl w:val="00A4ED2A"/>
@@ -11767,7 +12166,7 @@
       </w:rPr>
     </w:lvl>
   </w:abstractNum>
-  <w:abstractNum w:abstractNumId="41" w15:restartNumberingAfterBreak="0">
+  <w:abstractNum w:abstractNumId="47" w15:restartNumberingAfterBreak="0">
     <w:nsid w:val="72B6776C"/>
     <w:multiLevelType w:val="hybridMultilevel"/>
     <w:tmpl w:val="615ECB32"/>
@@ -11880,7 +12279,7 @@
       </w:rPr>
     </w:lvl>
   </w:abstractNum>
-  <w:abstractNum w:abstractNumId="42" w15:restartNumberingAfterBreak="0">
+  <w:abstractNum w:abstractNumId="48" w15:restartNumberingAfterBreak="0">
     <w:nsid w:val="73A54EFF"/>
     <w:multiLevelType w:val="multilevel"/>
     <w:tmpl w:val="A3EADF2A"/>
@@ -12029,7 +12428,7 @@
       </w:rPr>
     </w:lvl>
   </w:abstractNum>
-  <w:abstractNum w:abstractNumId="43" w15:restartNumberingAfterBreak="0">
+  <w:abstractNum w:abstractNumId="49" w15:restartNumberingAfterBreak="0">
     <w:nsid w:val="73F13157"/>
     <w:multiLevelType w:val="hybridMultilevel"/>
     <w:tmpl w:val="06486FBA"/>
@@ -12142,7 +12541,7 @@
       </w:rPr>
     </w:lvl>
   </w:abstractNum>
-  <w:abstractNum w:abstractNumId="44" w15:restartNumberingAfterBreak="0">
+  <w:abstractNum w:abstractNumId="50" w15:restartNumberingAfterBreak="0">
     <w:nsid w:val="740A7427"/>
     <w:multiLevelType w:val="hybridMultilevel"/>
     <w:tmpl w:val="ABB2615E"/>
@@ -12254,7 +12653,7 @@
       </w:rPr>
     </w:lvl>
   </w:abstractNum>
-  <w:abstractNum w:abstractNumId="45" w15:restartNumberingAfterBreak="0">
+  <w:abstractNum w:abstractNumId="51" w15:restartNumberingAfterBreak="0">
     <w:nsid w:val="748C6CFF"/>
     <w:multiLevelType w:val="hybridMultilevel"/>
     <w:tmpl w:val="6DB65E7A"/>
@@ -12366,7 +12765,7 @@
       </w:rPr>
     </w:lvl>
   </w:abstractNum>
-  <w:abstractNum w:abstractNumId="46" w15:restartNumberingAfterBreak="0">
+  <w:abstractNum w:abstractNumId="52" w15:restartNumberingAfterBreak="0">
     <w:nsid w:val="75994119"/>
     <w:multiLevelType w:val="hybridMultilevel"/>
     <w:tmpl w:val="2FD8CC6C"/>
@@ -12479,7 +12878,121 @@
       </w:rPr>
     </w:lvl>
   </w:abstractNum>
-  <w:abstractNum w:abstractNumId="47" w15:restartNumberingAfterBreak="0">
+  <w:abstractNum w:abstractNumId="53" w15:restartNumberingAfterBreak="0">
+    <w:nsid w:val="78ED7AA3"/>
+    <w:multiLevelType w:val="hybridMultilevel"/>
+    <w:tmpl w:val="2646ABCE"/>
+    <w:lvl w:ilvl="0" w:tplc="0C090001">
+      <w:start w:val="1"/>
+      <w:numFmt w:val="bullet"/>
+      <w:lvlText w:val=""/>
+      <w:lvlJc w:val="left"/>
+      <w:pPr>
+        <w:ind w:left="720" w:hanging="360"/>
+      </w:pPr>
+      <w:rPr>
+        <w:rFonts w:ascii="Symbol" w:hAnsi="Symbol" w:hint="default"/>
+      </w:rPr>
+    </w:lvl>
+    <w:lvl w:ilvl="1" w:tplc="A518171C">
+      <w:numFmt w:val="bullet"/>
+      <w:lvlText w:val="•"/>
+      <w:lvlJc w:val="left"/>
+      <w:pPr>
+        <w:ind w:left="1800" w:hanging="720"/>
+      </w:pPr>
+      <w:rPr>
+        <w:rFonts w:ascii="Avenir Next" w:eastAsia="Times New Roman" w:hAnsi="Avenir Next" w:cs="Avenir Next" w:hint="default"/>
+        <w:color w:val="171B24"/>
+        <w:sz w:val="24"/>
+      </w:rPr>
+    </w:lvl>
+    <w:lvl w:ilvl="2" w:tplc="0C090005" w:tentative="1">
+      <w:start w:val="1"/>
+      <w:numFmt w:val="bullet"/>
+      <w:lvlText w:val=""/>
+      <w:lvlJc w:val="left"/>
+      <w:pPr>
+        <w:ind w:left="2160" w:hanging="360"/>
+      </w:pPr>
+      <w:rPr>
+        <w:rFonts w:ascii="Wingdings" w:hAnsi="Wingdings" w:hint="default"/>
+      </w:rPr>
+    </w:lvl>
+    <w:lvl w:ilvl="3" w:tplc="0C090001" w:tentative="1">
+      <w:start w:val="1"/>
+      <w:numFmt w:val="bullet"/>
+      <w:lvlText w:val=""/>
+      <w:lvlJc w:val="left"/>
+      <w:pPr>
+        <w:ind w:left="2880" w:hanging="360"/>
+      </w:pPr>
+      <w:rPr>
+        <w:rFonts w:ascii="Symbol" w:hAnsi="Symbol" w:hint="default"/>
+      </w:rPr>
+    </w:lvl>
+    <w:lvl w:ilvl="4" w:tplc="0C090003" w:tentative="1">
+      <w:start w:val="1"/>
+      <w:numFmt w:val="bullet"/>
+      <w:lvlText w:val="o"/>
+      <w:lvlJc w:val="left"/>
+      <w:pPr>
+        <w:ind w:left="3600" w:hanging="360"/>
+      </w:pPr>
+      <w:rPr>
+        <w:rFonts w:ascii="Courier New" w:hAnsi="Courier New" w:cs="Courier New" w:hint="default"/>
+      </w:rPr>
+    </w:lvl>
+    <w:lvl w:ilvl="5" w:tplc="0C090005" w:tentative="1">
+      <w:start w:val="1"/>
+      <w:numFmt w:val="bullet"/>
+      <w:lvlText w:val=""/>
+      <w:lvlJc w:val="left"/>
+      <w:pPr>
+        <w:ind w:left="4320" w:hanging="360"/>
+      </w:pPr>
+      <w:rPr>
+        <w:rFonts w:ascii="Wingdings" w:hAnsi="Wingdings" w:hint="default"/>
+      </w:rPr>
+    </w:lvl>
+    <w:lvl w:ilvl="6" w:tplc="0C090001" w:tentative="1">
+      <w:start w:val="1"/>
+      <w:numFmt w:val="bullet"/>
+      <w:lvlText w:val=""/>
+      <w:lvlJc w:val="left"/>
+      <w:pPr>
+        <w:ind w:left="5040" w:hanging="360"/>
+      </w:pPr>
+      <w:rPr>
+        <w:rFonts w:ascii="Symbol" w:hAnsi="Symbol" w:hint="default"/>
+      </w:rPr>
+    </w:lvl>
+    <w:lvl w:ilvl="7" w:tplc="0C090003" w:tentative="1">
+      <w:start w:val="1"/>
+      <w:numFmt w:val="bullet"/>
+      <w:lvlText w:val="o"/>
+      <w:lvlJc w:val="left"/>
+      <w:pPr>
+        <w:ind w:left="5760" w:hanging="360"/>
+      </w:pPr>
+      <w:rPr>
+        <w:rFonts w:ascii="Courier New" w:hAnsi="Courier New" w:cs="Courier New" w:hint="default"/>
+      </w:rPr>
+    </w:lvl>
+    <w:lvl w:ilvl="8" w:tplc="0C090005" w:tentative="1">
+      <w:start w:val="1"/>
+      <w:numFmt w:val="bullet"/>
+      <w:lvlText w:val=""/>
+      <w:lvlJc w:val="left"/>
+      <w:pPr>
+        <w:ind w:left="6480" w:hanging="360"/>
+      </w:pPr>
+      <w:rPr>
+        <w:rFonts w:ascii="Wingdings" w:hAnsi="Wingdings" w:hint="default"/>
+      </w:rPr>
+    </w:lvl>
+  </w:abstractNum>
+  <w:abstractNum w:abstractNumId="54" w15:restartNumberingAfterBreak="0">
     <w:nsid w:val="7ADB6E30"/>
     <w:multiLevelType w:val="hybridMultilevel"/>
     <w:tmpl w:val="D62868AC"/>
@@ -12592,7 +13105,7 @@
       </w:rPr>
     </w:lvl>
   </w:abstractNum>
-  <w:abstractNum w:abstractNumId="48" w15:restartNumberingAfterBreak="0">
+  <w:abstractNum w:abstractNumId="55" w15:restartNumberingAfterBreak="0">
     <w:nsid w:val="7B681949"/>
     <w:multiLevelType w:val="hybridMultilevel"/>
     <w:tmpl w:val="6B869106"/>
@@ -12705,7 +13218,7 @@
       </w:rPr>
     </w:lvl>
   </w:abstractNum>
-  <w:abstractNum w:abstractNumId="49" w15:restartNumberingAfterBreak="0">
+  <w:abstractNum w:abstractNumId="56" w15:restartNumberingAfterBreak="0">
     <w:nsid w:val="7C3D77EE"/>
     <w:multiLevelType w:val="hybridMultilevel"/>
     <w:tmpl w:val="9530B578"/>
@@ -12818,7 +13331,7 @@
       </w:rPr>
     </w:lvl>
   </w:abstractNum>
-  <w:abstractNum w:abstractNumId="50" w15:restartNumberingAfterBreak="0">
+  <w:abstractNum w:abstractNumId="57" w15:restartNumberingAfterBreak="0">
     <w:nsid w:val="7CD26314"/>
     <w:multiLevelType w:val="hybridMultilevel"/>
     <w:tmpl w:val="80CA3F60"/>
@@ -12931,7 +13444,7 @@
       </w:rPr>
     </w:lvl>
   </w:abstractNum>
-  <w:abstractNum w:abstractNumId="51" w15:restartNumberingAfterBreak="0">
+  <w:abstractNum w:abstractNumId="58" w15:restartNumberingAfterBreak="0">
     <w:nsid w:val="7FF05EE4"/>
     <w:multiLevelType w:val="hybridMultilevel"/>
     <w:tmpl w:val="40E05126"/>
@@ -13045,160 +13558,181 @@
     </w:lvl>
   </w:abstractNum>
   <w:num w:numId="1" w16cid:durableId="1462723356">
-    <w:abstractNumId w:val="45"/>
+    <w:abstractNumId w:val="51"/>
   </w:num>
   <w:num w:numId="2" w16cid:durableId="163328248">
     <w:abstractNumId w:val="1"/>
   </w:num>
   <w:num w:numId="3" w16cid:durableId="585454051">
-    <w:abstractNumId w:val="44"/>
+    <w:abstractNumId w:val="50"/>
   </w:num>
   <w:num w:numId="4" w16cid:durableId="372002136">
-    <w:abstractNumId w:val="32"/>
+    <w:abstractNumId w:val="37"/>
   </w:num>
   <w:num w:numId="5" w16cid:durableId="1034110762">
-    <w:abstractNumId w:val="25"/>
+    <w:abstractNumId w:val="29"/>
   </w:num>
   <w:num w:numId="6" w16cid:durableId="2051925">
-    <w:abstractNumId w:val="29"/>
+    <w:abstractNumId w:val="34"/>
   </w:num>
   <w:num w:numId="7" w16cid:durableId="924220898">
-    <w:abstractNumId w:val="18"/>
+    <w:abstractNumId w:val="21"/>
   </w:num>
   <w:num w:numId="8" w16cid:durableId="1767916256">
-    <w:abstractNumId w:val="16"/>
+    <w:abstractNumId w:val="19"/>
   </w:num>
   <w:num w:numId="9" w16cid:durableId="680474245">
     <w:abstractNumId w:val="2"/>
   </w:num>
   <w:num w:numId="10" w16cid:durableId="321396736">
-    <w:abstractNumId w:val="38"/>
+    <w:abstractNumId w:val="44"/>
   </w:num>
   <w:num w:numId="11" w16cid:durableId="1383628109">
-    <w:abstractNumId w:val="27"/>
+    <w:abstractNumId w:val="31"/>
   </w:num>
   <w:num w:numId="12" w16cid:durableId="670378332">
-    <w:abstractNumId w:val="8"/>
+    <w:abstractNumId w:val="11"/>
   </w:num>
   <w:num w:numId="13" w16cid:durableId="354500226">
-    <w:abstractNumId w:val="11"/>
+    <w:abstractNumId w:val="14"/>
   </w:num>
   <w:num w:numId="14" w16cid:durableId="926235410">
-    <w:abstractNumId w:val="51"/>
+    <w:abstractNumId w:val="58"/>
   </w:num>
   <w:num w:numId="15" w16cid:durableId="1069961863">
-    <w:abstractNumId w:val="14"/>
+    <w:abstractNumId w:val="17"/>
   </w:num>
   <w:num w:numId="16" w16cid:durableId="1451704893">
-    <w:abstractNumId w:val="49"/>
+    <w:abstractNumId w:val="56"/>
   </w:num>
   <w:num w:numId="17" w16cid:durableId="108474774">
-    <w:abstractNumId w:val="24"/>
+    <w:abstractNumId w:val="28"/>
   </w:num>
   <w:num w:numId="18" w16cid:durableId="108012200">
-    <w:abstractNumId w:val="47"/>
+    <w:abstractNumId w:val="54"/>
   </w:num>
   <w:num w:numId="19" w16cid:durableId="681854210">
-    <w:abstractNumId w:val="17"/>
+    <w:abstractNumId w:val="20"/>
   </w:num>
   <w:num w:numId="20" w16cid:durableId="831331594">
-    <w:abstractNumId w:val="50"/>
+    <w:abstractNumId w:val="57"/>
   </w:num>
   <w:num w:numId="21" w16cid:durableId="1989436382">
-    <w:abstractNumId w:val="28"/>
+    <w:abstractNumId w:val="32"/>
   </w:num>
   <w:num w:numId="22" w16cid:durableId="351420169">
-    <w:abstractNumId w:val="46"/>
+    <w:abstractNumId w:val="52"/>
   </w:num>
   <w:num w:numId="23" w16cid:durableId="1860462834">
-    <w:abstractNumId w:val="34"/>
+    <w:abstractNumId w:val="40"/>
   </w:num>
   <w:num w:numId="24" w16cid:durableId="1734502095">
-    <w:abstractNumId w:val="26"/>
+    <w:abstractNumId w:val="30"/>
   </w:num>
   <w:num w:numId="25" w16cid:durableId="1749228422">
-    <w:abstractNumId w:val="35"/>
+    <w:abstractNumId w:val="41"/>
   </w:num>
   <w:num w:numId="26" w16cid:durableId="642079521">
-    <w:abstractNumId w:val="6"/>
+    <w:abstractNumId w:val="8"/>
   </w:num>
   <w:num w:numId="27" w16cid:durableId="1032153830">
     <w:abstractNumId w:val="0"/>
   </w:num>
   <w:num w:numId="28" w16cid:durableId="1190993357">
+    <w:abstractNumId w:val="12"/>
+  </w:num>
+  <w:num w:numId="29" w16cid:durableId="1744136075">
+    <w:abstractNumId w:val="42"/>
+  </w:num>
+  <w:num w:numId="30" w16cid:durableId="232663078">
+    <w:abstractNumId w:val="5"/>
+  </w:num>
+  <w:num w:numId="31" w16cid:durableId="26687272">
+    <w:abstractNumId w:val="46"/>
+  </w:num>
+  <w:num w:numId="32" w16cid:durableId="1168053469">
+    <w:abstractNumId w:val="16"/>
+  </w:num>
+  <w:num w:numId="33" w16cid:durableId="507328918">
+    <w:abstractNumId w:val="55"/>
+  </w:num>
+  <w:num w:numId="34" w16cid:durableId="1915506872">
+    <w:abstractNumId w:val="27"/>
+  </w:num>
+  <w:num w:numId="35" w16cid:durableId="1571383532">
+    <w:abstractNumId w:val="26"/>
+  </w:num>
+  <w:num w:numId="36" w16cid:durableId="1629318415">
+    <w:abstractNumId w:val="24"/>
+  </w:num>
+  <w:num w:numId="37" w16cid:durableId="790897479">
+    <w:abstractNumId w:val="4"/>
+  </w:num>
+  <w:num w:numId="38" w16cid:durableId="1718233903">
+    <w:abstractNumId w:val="47"/>
+  </w:num>
+  <w:num w:numId="39" w16cid:durableId="621115960">
+    <w:abstractNumId w:val="6"/>
+  </w:num>
+  <w:num w:numId="40" w16cid:durableId="2041971159">
+    <w:abstractNumId w:val="48"/>
+  </w:num>
+  <w:num w:numId="41" w16cid:durableId="985474669">
+    <w:abstractNumId w:val="13"/>
+  </w:num>
+  <w:num w:numId="42" w16cid:durableId="1790927603">
+    <w:abstractNumId w:val="35"/>
+  </w:num>
+  <w:num w:numId="43" w16cid:durableId="2141144137">
+    <w:abstractNumId w:val="49"/>
+  </w:num>
+  <w:num w:numId="44" w16cid:durableId="914700829">
+    <w:abstractNumId w:val="18"/>
+  </w:num>
+  <w:num w:numId="45" w16cid:durableId="204755473">
+    <w:abstractNumId w:val="45"/>
+  </w:num>
+  <w:num w:numId="46" w16cid:durableId="1607998924">
+    <w:abstractNumId w:val="22"/>
+  </w:num>
+  <w:num w:numId="47" w16cid:durableId="861283777">
+    <w:abstractNumId w:val="25"/>
+  </w:num>
+  <w:num w:numId="48" w16cid:durableId="1746027870">
+    <w:abstractNumId w:val="15"/>
+  </w:num>
+  <w:num w:numId="49" w16cid:durableId="81487424">
+    <w:abstractNumId w:val="43"/>
+  </w:num>
+  <w:num w:numId="50" w16cid:durableId="992488856">
+    <w:abstractNumId w:val="38"/>
+  </w:num>
+  <w:num w:numId="51" w16cid:durableId="1493909518">
+    <w:abstractNumId w:val="36"/>
+  </w:num>
+  <w:num w:numId="52" w16cid:durableId="1950501735">
+    <w:abstractNumId w:val="10"/>
+  </w:num>
+  <w:num w:numId="53" w16cid:durableId="1396468685">
+    <w:abstractNumId w:val="39"/>
+  </w:num>
+  <w:num w:numId="54" w16cid:durableId="1497110361">
+    <w:abstractNumId w:val="53"/>
+  </w:num>
+  <w:num w:numId="55" w16cid:durableId="1927304298">
     <w:abstractNumId w:val="9"/>
   </w:num>
-  <w:num w:numId="29" w16cid:durableId="1744136075">
-    <w:abstractNumId w:val="36"/>
-  </w:num>
-  <w:num w:numId="30" w16cid:durableId="232663078">
-    <w:abstractNumId w:val="4"/>
-  </w:num>
-  <w:num w:numId="31" w16cid:durableId="26687272">
-    <w:abstractNumId w:val="40"/>
-  </w:num>
-  <w:num w:numId="32" w16cid:durableId="1168053469">
-    <w:abstractNumId w:val="13"/>
-  </w:num>
-  <w:num w:numId="33" w16cid:durableId="507328918">
-    <w:abstractNumId w:val="48"/>
-  </w:num>
-  <w:num w:numId="34" w16cid:durableId="1915506872">
-    <w:abstractNumId w:val="23"/>
-  </w:num>
-  <w:num w:numId="35" w16cid:durableId="1571383532">
-    <w:abstractNumId w:val="22"/>
-  </w:num>
-  <w:num w:numId="36" w16cid:durableId="1629318415">
-    <w:abstractNumId w:val="20"/>
-  </w:num>
-  <w:num w:numId="37" w16cid:durableId="790897479">
+  <w:num w:numId="56" w16cid:durableId="966618382">
     <w:abstractNumId w:val="3"/>
   </w:num>
-  <w:num w:numId="38" w16cid:durableId="1718233903">
-    <w:abstractNumId w:val="41"/>
+  <w:num w:numId="57" w16cid:durableId="695037241">
+    <w:abstractNumId w:val="7"/>
   </w:num>
-  <w:num w:numId="39" w16cid:durableId="621115960">
-    <w:abstractNumId w:val="5"/>
-  </w:num>
-  <w:num w:numId="40" w16cid:durableId="2041971159">
-    <w:abstractNumId w:val="42"/>
-  </w:num>
-  <w:num w:numId="41" w16cid:durableId="985474669">
-    <w:abstractNumId w:val="10"/>
-  </w:num>
-  <w:num w:numId="42" w16cid:durableId="1790927603">
-    <w:abstractNumId w:val="30"/>
-  </w:num>
-  <w:num w:numId="43" w16cid:durableId="2141144137">
-    <w:abstractNumId w:val="43"/>
-  </w:num>
-  <w:num w:numId="44" w16cid:durableId="914700829">
-    <w:abstractNumId w:val="15"/>
-  </w:num>
-  <w:num w:numId="45" w16cid:durableId="204755473">
-    <w:abstractNumId w:val="39"/>
-  </w:num>
-  <w:num w:numId="46" w16cid:durableId="1607998924">
-    <w:abstractNumId w:val="19"/>
-  </w:num>
-  <w:num w:numId="47" w16cid:durableId="861283777">
-    <w:abstractNumId w:val="21"/>
-  </w:num>
-  <w:num w:numId="48" w16cid:durableId="1746027870">
-    <w:abstractNumId w:val="12"/>
-  </w:num>
-  <w:num w:numId="49" w16cid:durableId="81487424">
-    <w:abstractNumId w:val="37"/>
-  </w:num>
-  <w:num w:numId="50" w16cid:durableId="992488856">
+  <w:num w:numId="58" w16cid:durableId="1437141304">
     <w:abstractNumId w:val="33"/>
   </w:num>
-  <w:num w:numId="51" w16cid:durableId="1493909518">
-    <w:abstractNumId w:val="31"/>
-  </w:num>
-  <w:num w:numId="52" w16cid:durableId="1950501735">
-    <w:abstractNumId w:val="7"/>
+  <w:num w:numId="59" w16cid:durableId="1629817724">
+    <w:abstractNumId w:val="23"/>
   </w:num>
   <w:numIdMacAtCleanup w:val="6"/>
 </w:numbering>
@@ -13651,7 +14185,6 @@
     <w:next w:val="Normal"/>
     <w:link w:val="Heading3Char"/>
     <w:uiPriority w:val="9"/>
-    <w:semiHidden/>
     <w:unhideWhenUsed/>
     <w:qFormat/>
     <w:rsid w:val="00F661A6"/>
@@ -13854,7 +14387,6 @@
     <w:basedOn w:val="DefaultParagraphFont"/>
     <w:link w:val="Heading3"/>
     <w:uiPriority w:val="9"/>
-    <w:semiHidden/>
     <w:rsid w:val="00F661A6"/>
     <w:rPr>
       <w:rFonts w:asciiTheme="majorHAnsi" w:eastAsiaTheme="majorEastAsia" w:hAnsiTheme="majorHAnsi" w:cstheme="majorBidi"/>
@@ -13909,7 +14441,6 @@
     <w:name w:val="Normal (Web)"/>
     <w:basedOn w:val="Normal"/>
     <w:uiPriority w:val="99"/>
-    <w:semiHidden/>
     <w:unhideWhenUsed/>
     <w:rsid w:val="00353673"/>
     <w:pPr>
@@ -23683,7 +24214,7 @@
       <dsp:spPr>
         <a:xfrm>
           <a:off x="0" y="592"/>
-          <a:ext cx="1099524" cy="373177"/>
+          <a:ext cx="1099185" cy="373142"/>
         </a:xfrm>
         <a:prstGeom prst="roundRect">
           <a:avLst>
@@ -23760,8 +24291,8 @@
         </a:p>
       </dsp:txBody>
       <dsp:txXfrm>
-        <a:off x="10930" y="11522"/>
-        <a:ext cx="1077664" cy="351317"/>
+        <a:off x="10929" y="11521"/>
+        <a:ext cx="1077327" cy="351284"/>
       </dsp:txXfrm>
     </dsp:sp>
     <dsp:sp modelId="{8B85E329-F4ED-42F3-AFE4-217A2C6C7550}">
@@ -23771,8 +24302,8 @@
       </dsp:nvSpPr>
       <dsp:spPr>
         <a:xfrm rot="5400000">
-          <a:off x="479791" y="383099"/>
-          <a:ext cx="139941" cy="167929"/>
+          <a:off x="479628" y="383063"/>
+          <a:ext cx="139928" cy="167914"/>
         </a:xfrm>
         <a:prstGeom prst="rightArrow">
           <a:avLst>
@@ -23830,8 +24361,8 @@
         </a:p>
       </dsp:txBody>
       <dsp:txXfrm rot="-5400000">
-        <a:off x="499383" y="397093"/>
-        <a:ext cx="100757" cy="97959"/>
+        <a:off x="499218" y="397056"/>
+        <a:ext cx="100748" cy="97950"/>
       </dsp:txXfrm>
     </dsp:sp>
     <dsp:sp modelId="{DBAF54D2-D194-4DC0-8F3E-CF20CD0BD1F2}">
@@ -23841,8 +24372,8 @@
       </dsp:nvSpPr>
       <dsp:spPr>
         <a:xfrm>
-          <a:off x="0" y="560358"/>
-          <a:ext cx="1099524" cy="373177"/>
+          <a:off x="0" y="560305"/>
+          <a:ext cx="1099185" cy="373142"/>
         </a:xfrm>
         <a:prstGeom prst="roundRect">
           <a:avLst>
@@ -23919,8 +24450,8 @@
         </a:p>
       </dsp:txBody>
       <dsp:txXfrm>
-        <a:off x="10930" y="571288"/>
-        <a:ext cx="1077664" cy="351317"/>
+        <a:off x="10929" y="571234"/>
+        <a:ext cx="1077327" cy="351284"/>
       </dsp:txXfrm>
     </dsp:sp>
     <dsp:sp modelId="{C9D06F10-7AA5-4F01-9975-EDB1A98F08DE}">
@@ -23930,8 +24461,8 @@
       </dsp:nvSpPr>
       <dsp:spPr>
         <a:xfrm rot="5400000">
-          <a:off x="479791" y="942865"/>
-          <a:ext cx="139941" cy="167929"/>
+          <a:off x="479628" y="942776"/>
+          <a:ext cx="139928" cy="167914"/>
         </a:xfrm>
         <a:prstGeom prst="rightArrow">
           <a:avLst>
@@ -23989,8 +24520,8 @@
         </a:p>
       </dsp:txBody>
       <dsp:txXfrm rot="-5400000">
-        <a:off x="499383" y="956859"/>
-        <a:ext cx="100757" cy="97959"/>
+        <a:off x="499218" y="956769"/>
+        <a:ext cx="100748" cy="97950"/>
       </dsp:txXfrm>
     </dsp:sp>
     <dsp:sp modelId="{A166382C-C6BE-4F61-BD18-EA56B056F18D}">
@@ -24000,8 +24531,8 @@
       </dsp:nvSpPr>
       <dsp:spPr>
         <a:xfrm>
-          <a:off x="0" y="1120124"/>
-          <a:ext cx="1099524" cy="373177"/>
+          <a:off x="0" y="1120019"/>
+          <a:ext cx="1099185" cy="373142"/>
         </a:xfrm>
         <a:prstGeom prst="roundRect">
           <a:avLst>
@@ -24078,8 +24609,8 @@
         </a:p>
       </dsp:txBody>
       <dsp:txXfrm>
-        <a:off x="10930" y="1131054"/>
-        <a:ext cx="1077664" cy="351317"/>
+        <a:off x="10929" y="1130948"/>
+        <a:ext cx="1077327" cy="351284"/>
       </dsp:txXfrm>
     </dsp:sp>
     <dsp:sp modelId="{22661930-FE2E-4828-B6D1-FF1450F85D61}">
@@ -24089,8 +24620,8 @@
       </dsp:nvSpPr>
       <dsp:spPr>
         <a:xfrm rot="5400000">
-          <a:off x="479791" y="1502631"/>
-          <a:ext cx="139941" cy="167929"/>
+          <a:off x="479628" y="1502490"/>
+          <a:ext cx="139928" cy="167914"/>
         </a:xfrm>
         <a:prstGeom prst="rightArrow">
           <a:avLst>
@@ -24148,8 +24679,8 @@
         </a:p>
       </dsp:txBody>
       <dsp:txXfrm rot="-5400000">
-        <a:off x="499383" y="1516625"/>
-        <a:ext cx="100757" cy="97959"/>
+        <a:off x="499218" y="1516483"/>
+        <a:ext cx="100748" cy="97950"/>
       </dsp:txXfrm>
     </dsp:sp>
     <dsp:sp modelId="{F07372BD-54D8-4709-9914-06E75496505B}">
@@ -24159,8 +24690,8 @@
       </dsp:nvSpPr>
       <dsp:spPr>
         <a:xfrm>
-          <a:off x="0" y="1679890"/>
-          <a:ext cx="1099524" cy="373177"/>
+          <a:off x="0" y="1679732"/>
+          <a:ext cx="1099185" cy="373142"/>
         </a:xfrm>
         <a:prstGeom prst="roundRect">
           <a:avLst>
@@ -24237,8 +24768,8 @@
         </a:p>
       </dsp:txBody>
       <dsp:txXfrm>
-        <a:off x="10930" y="1690820"/>
-        <a:ext cx="1077664" cy="351317"/>
+        <a:off x="10929" y="1690661"/>
+        <a:ext cx="1077327" cy="351284"/>
       </dsp:txXfrm>
     </dsp:sp>
     <dsp:sp modelId="{DB8E291D-FF71-4EE2-B404-EEC0CB0423D9}">
@@ -24248,8 +24779,8 @@
       </dsp:nvSpPr>
       <dsp:spPr>
         <a:xfrm rot="5400000">
-          <a:off x="479791" y="2062397"/>
-          <a:ext cx="139941" cy="167929"/>
+          <a:off x="479628" y="2062203"/>
+          <a:ext cx="139928" cy="167914"/>
         </a:xfrm>
         <a:prstGeom prst="rightArrow">
           <a:avLst>
@@ -24307,8 +24838,8 @@
         </a:p>
       </dsp:txBody>
       <dsp:txXfrm rot="-5400000">
-        <a:off x="499383" y="2076391"/>
-        <a:ext cx="100757" cy="97959"/>
+        <a:off x="499218" y="2076196"/>
+        <a:ext cx="100748" cy="97950"/>
       </dsp:txXfrm>
     </dsp:sp>
     <dsp:sp modelId="{2ADB20F3-5F5C-40D6-8C35-9A6FCCAFFAAB}">
@@ -24318,8 +24849,8 @@
       </dsp:nvSpPr>
       <dsp:spPr>
         <a:xfrm>
-          <a:off x="0" y="2239656"/>
-          <a:ext cx="1099524" cy="373177"/>
+          <a:off x="0" y="2239446"/>
+          <a:ext cx="1099185" cy="373142"/>
         </a:xfrm>
         <a:prstGeom prst="roundRect">
           <a:avLst>
@@ -24396,8 +24927,8 @@
         </a:p>
       </dsp:txBody>
       <dsp:txXfrm>
-        <a:off x="10930" y="2250586"/>
-        <a:ext cx="1077664" cy="351317"/>
+        <a:off x="10929" y="2250375"/>
+        <a:ext cx="1077327" cy="351284"/>
       </dsp:txXfrm>
     </dsp:sp>
     <dsp:sp modelId="{2752DAFE-F8CE-4117-B63F-5D8CC96118CD}">
@@ -24407,8 +24938,8 @@
       </dsp:nvSpPr>
       <dsp:spPr>
         <a:xfrm rot="5400000">
-          <a:off x="479791" y="2622163"/>
-          <a:ext cx="139941" cy="167929"/>
+          <a:off x="479628" y="2621917"/>
+          <a:ext cx="139928" cy="167914"/>
         </a:xfrm>
         <a:prstGeom prst="rightArrow">
           <a:avLst>
@@ -24466,8 +24997,8 @@
         </a:p>
       </dsp:txBody>
       <dsp:txXfrm rot="-5400000">
-        <a:off x="499383" y="2636157"/>
-        <a:ext cx="100757" cy="97959"/>
+        <a:off x="499218" y="2635910"/>
+        <a:ext cx="100748" cy="97950"/>
       </dsp:txXfrm>
     </dsp:sp>
     <dsp:sp modelId="{789E6107-F3B2-46D8-8631-4334914F750E}">
@@ -24477,8 +25008,8 @@
       </dsp:nvSpPr>
       <dsp:spPr>
         <a:xfrm>
-          <a:off x="0" y="2799422"/>
-          <a:ext cx="1099524" cy="373177"/>
+          <a:off x="0" y="2799159"/>
+          <a:ext cx="1099185" cy="373142"/>
         </a:xfrm>
         <a:prstGeom prst="roundRect">
           <a:avLst>
@@ -24555,8 +25086,8 @@
         </a:p>
       </dsp:txBody>
       <dsp:txXfrm>
-        <a:off x="10930" y="2810352"/>
-        <a:ext cx="1077664" cy="351317"/>
+        <a:off x="10929" y="2810088"/>
+        <a:ext cx="1077327" cy="351284"/>
       </dsp:txXfrm>
     </dsp:sp>
     <dsp:sp modelId="{AEDBEF25-A99C-4457-A557-BB95E54E88A4}">
@@ -24566,8 +25097,8 @@
       </dsp:nvSpPr>
       <dsp:spPr>
         <a:xfrm rot="5400000">
-          <a:off x="479791" y="3181929"/>
-          <a:ext cx="139941" cy="167929"/>
+          <a:off x="479628" y="3181630"/>
+          <a:ext cx="139928" cy="167914"/>
         </a:xfrm>
         <a:prstGeom prst="rightArrow">
           <a:avLst>
@@ -24625,8 +25156,8 @@
         </a:p>
       </dsp:txBody>
       <dsp:txXfrm rot="-5400000">
-        <a:off x="499383" y="3195923"/>
-        <a:ext cx="100757" cy="97959"/>
+        <a:off x="499218" y="3195623"/>
+        <a:ext cx="100748" cy="97950"/>
       </dsp:txXfrm>
     </dsp:sp>
     <dsp:sp modelId="{92557B72-4E6A-45D9-AD00-07E1DFFA7922}">
@@ -24636,8 +25167,8 @@
       </dsp:nvSpPr>
       <dsp:spPr>
         <a:xfrm>
-          <a:off x="0" y="3359189"/>
-          <a:ext cx="1099524" cy="373177"/>
+          <a:off x="0" y="3358873"/>
+          <a:ext cx="1099185" cy="373142"/>
         </a:xfrm>
         <a:prstGeom prst="roundRect">
           <a:avLst>
@@ -24714,8 +25245,8 @@
         </a:p>
       </dsp:txBody>
       <dsp:txXfrm>
-        <a:off x="10930" y="3370119"/>
-        <a:ext cx="1077664" cy="351317"/>
+        <a:off x="10929" y="3369802"/>
+        <a:ext cx="1077327" cy="351284"/>
       </dsp:txXfrm>
     </dsp:sp>
     <dsp:sp modelId="{A920CFEC-4B6B-49A7-8C5C-3C6083B36F6E}">
@@ -24725,8 +25256,8 @@
       </dsp:nvSpPr>
       <dsp:spPr>
         <a:xfrm rot="5400000">
-          <a:off x="479791" y="3741695"/>
-          <a:ext cx="139941" cy="167929"/>
+          <a:off x="479628" y="3741344"/>
+          <a:ext cx="139928" cy="167914"/>
         </a:xfrm>
         <a:prstGeom prst="rightArrow">
           <a:avLst>
@@ -24784,8 +25315,8 @@
         </a:p>
       </dsp:txBody>
       <dsp:txXfrm rot="-5400000">
-        <a:off x="499383" y="3755689"/>
-        <a:ext cx="100757" cy="97959"/>
+        <a:off x="499218" y="3755337"/>
+        <a:ext cx="100748" cy="97950"/>
       </dsp:txXfrm>
     </dsp:sp>
     <dsp:sp modelId="{B8D126AF-8196-4A7E-8DED-1A98BC550BF5}">
@@ -24795,8 +25326,8 @@
       </dsp:nvSpPr>
       <dsp:spPr>
         <a:xfrm>
-          <a:off x="0" y="3918955"/>
-          <a:ext cx="1099524" cy="373177"/>
+          <a:off x="0" y="3918586"/>
+          <a:ext cx="1099185" cy="373142"/>
         </a:xfrm>
         <a:prstGeom prst="roundRect">
           <a:avLst>
@@ -24873,8 +25404,8 @@
         </a:p>
       </dsp:txBody>
       <dsp:txXfrm>
-        <a:off x="10930" y="3929885"/>
-        <a:ext cx="1077664" cy="351317"/>
+        <a:off x="10929" y="3929515"/>
+        <a:ext cx="1077327" cy="351284"/>
       </dsp:txXfrm>
     </dsp:sp>
     <dsp:sp modelId="{E4BD1B2A-38FD-4221-89B4-EA2621D83608}">
@@ -24884,8 +25415,8 @@
       </dsp:nvSpPr>
       <dsp:spPr>
         <a:xfrm rot="5400000">
-          <a:off x="479791" y="4301461"/>
-          <a:ext cx="139941" cy="167929"/>
+          <a:off x="479628" y="4301057"/>
+          <a:ext cx="139928" cy="167914"/>
         </a:xfrm>
         <a:prstGeom prst="rightArrow">
           <a:avLst>
@@ -24943,8 +25474,8 @@
         </a:p>
       </dsp:txBody>
       <dsp:txXfrm rot="-5400000">
-        <a:off x="499383" y="4315455"/>
-        <a:ext cx="100757" cy="97959"/>
+        <a:off x="499218" y="4315050"/>
+        <a:ext cx="100748" cy="97950"/>
       </dsp:txXfrm>
     </dsp:sp>
     <dsp:sp modelId="{CCEFCC35-B201-450E-9B5A-B2990A727BE4}">
@@ -24954,8 +25485,8 @@
       </dsp:nvSpPr>
       <dsp:spPr>
         <a:xfrm>
-          <a:off x="0" y="4478721"/>
-          <a:ext cx="1099524" cy="373177"/>
+          <a:off x="0" y="4478300"/>
+          <a:ext cx="1099185" cy="373142"/>
         </a:xfrm>
         <a:prstGeom prst="roundRect">
           <a:avLst>
@@ -25042,8 +25573,8 @@
         </a:p>
       </dsp:txBody>
       <dsp:txXfrm>
-        <a:off x="10930" y="4489651"/>
-        <a:ext cx="1077664" cy="351317"/>
+        <a:off x="10929" y="4489229"/>
+        <a:ext cx="1077327" cy="351284"/>
       </dsp:txXfrm>
     </dsp:sp>
   </dsp:spTree>

</xml_diff>